<commit_message>
docs: mark Etapa 2 as completed in control document
Co-Authored-By: Claude Sonnet 4.6 <noreply@anthropic.com>
</commit_message>
<xml_diff>
--- a/docs/credit_portfolio_analyzer_plan.docx
+++ b/docs/credit_portfolio_analyzer_plan.docx
@@ -12,7 +12,7 @@
       </w:pPr>
       <w:r>
         <w:rPr>
-          <w:rFonts w:eastAsia="Arial" w:cs="Arial" w:ascii="Arial" w:hAnsi="Arial"/>
+          <w:rFonts w:eastAsia="Arial" w:cs="Arial"/>
           <w:b/>
           <w:bCs/>
           <w:color w:val="FFFFFF"/>
@@ -23,7 +23,7 @@
       </w:r>
       <w:r>
         <w:rPr>
-          <w:rFonts w:eastAsia="Arial" w:cs="Arial" w:ascii="Arial" w:hAnsi="Arial"/>
+          <w:rFonts w:eastAsia="Arial" w:cs="Arial"/>
           <w:b/>
           <w:bCs/>
           <w:color w:val="FFFFFF"/>
@@ -83,14 +83,14 @@
         </w:tblCellMar>
       </w:tblPr>
       <w:tblGrid>
-        <w:gridCol w:w="1999"/>
-        <w:gridCol w:w="6361"/>
+        <w:gridCol w:w="1998"/>
+        <w:gridCol w:w="6362"/>
       </w:tblGrid>
       <w:tr>
         <w:trPr/>
         <w:tc>
           <w:tcPr>
-            <w:tcW w:w="1999" w:type="dxa"/>
+            <w:tcW w:w="1998" w:type="dxa"/>
             <w:tcBorders>
               <w:top w:val="single" w:sz="2" w:space="0" w:color="2E75B6"/>
               <w:start w:val="single" w:sz="2" w:space="0" w:color="2E75B6"/>
@@ -120,7 +120,7 @@
         </w:tc>
         <w:tc>
           <w:tcPr>
-            <w:tcW w:w="6361" w:type="dxa"/>
+            <w:tcW w:w="6362" w:type="dxa"/>
             <w:tcBorders>
               <w:top w:val="single" w:sz="2" w:space="0" w:color="2E75B6"/>
               <w:start w:val="single" w:sz="2" w:space="0" w:color="2E75B6"/>
@@ -153,7 +153,7 @@
         <w:trPr/>
         <w:tc>
           <w:tcPr>
-            <w:tcW w:w="1999" w:type="dxa"/>
+            <w:tcW w:w="1998" w:type="dxa"/>
             <w:tcBorders>
               <w:top w:val="single" w:sz="2" w:space="0" w:color="DDDDDD"/>
               <w:start w:val="single" w:sz="2" w:space="0" w:color="DDDDDD"/>
@@ -182,7 +182,7 @@
         </w:tc>
         <w:tc>
           <w:tcPr>
-            <w:tcW w:w="6361" w:type="dxa"/>
+            <w:tcW w:w="6362" w:type="dxa"/>
             <w:tcBorders>
               <w:top w:val="single" w:sz="2" w:space="0" w:color="DDDDDD"/>
               <w:start w:val="single" w:sz="2" w:space="0" w:color="DDDDDD"/>
@@ -213,7 +213,7 @@
         <w:trPr/>
         <w:tc>
           <w:tcPr>
-            <w:tcW w:w="1999" w:type="dxa"/>
+            <w:tcW w:w="1998" w:type="dxa"/>
             <w:tcBorders>
               <w:top w:val="single" w:sz="2" w:space="0" w:color="DDDDDD"/>
               <w:start w:val="single" w:sz="2" w:space="0" w:color="DDDDDD"/>
@@ -242,7 +242,7 @@
         </w:tc>
         <w:tc>
           <w:tcPr>
-            <w:tcW w:w="6361" w:type="dxa"/>
+            <w:tcW w:w="6362" w:type="dxa"/>
             <w:tcBorders>
               <w:top w:val="single" w:sz="2" w:space="0" w:color="DDDDDD"/>
               <w:start w:val="single" w:sz="2" w:space="0" w:color="DDDDDD"/>
@@ -273,7 +273,7 @@
         <w:trPr/>
         <w:tc>
           <w:tcPr>
-            <w:tcW w:w="1999" w:type="dxa"/>
+            <w:tcW w:w="1998" w:type="dxa"/>
             <w:tcBorders>
               <w:top w:val="single" w:sz="2" w:space="0" w:color="DDDDDD"/>
               <w:start w:val="single" w:sz="2" w:space="0" w:color="DDDDDD"/>
@@ -302,7 +302,7 @@
         </w:tc>
         <w:tc>
           <w:tcPr>
-            <w:tcW w:w="6361" w:type="dxa"/>
+            <w:tcW w:w="6362" w:type="dxa"/>
             <w:tcBorders>
               <w:top w:val="single" w:sz="2" w:space="0" w:color="DDDDDD"/>
               <w:start w:val="single" w:sz="2" w:space="0" w:color="DDDDDD"/>
@@ -333,7 +333,7 @@
         <w:trPr/>
         <w:tc>
           <w:tcPr>
-            <w:tcW w:w="1999" w:type="dxa"/>
+            <w:tcW w:w="1998" w:type="dxa"/>
             <w:tcBorders>
               <w:top w:val="single" w:sz="2" w:space="0" w:color="DDDDDD"/>
               <w:start w:val="single" w:sz="2" w:space="0" w:color="DDDDDD"/>
@@ -362,7 +362,7 @@
         </w:tc>
         <w:tc>
           <w:tcPr>
-            <w:tcW w:w="6361" w:type="dxa"/>
+            <w:tcW w:w="6362" w:type="dxa"/>
             <w:tcBorders>
               <w:top w:val="single" w:sz="2" w:space="0" w:color="DDDDDD"/>
               <w:start w:val="single" w:sz="2" w:space="0" w:color="DDDDDD"/>
@@ -393,7 +393,7 @@
         <w:trPr/>
         <w:tc>
           <w:tcPr>
-            <w:tcW w:w="1999" w:type="dxa"/>
+            <w:tcW w:w="1998" w:type="dxa"/>
             <w:tcBorders>
               <w:top w:val="single" w:sz="2" w:space="0" w:color="DDDDDD"/>
               <w:start w:val="single" w:sz="2" w:space="0" w:color="DDDDDD"/>
@@ -422,7 +422,7 @@
         </w:tc>
         <w:tc>
           <w:tcPr>
-            <w:tcW w:w="6361" w:type="dxa"/>
+            <w:tcW w:w="6362" w:type="dxa"/>
             <w:tcBorders>
               <w:top w:val="single" w:sz="2" w:space="0" w:color="DDDDDD"/>
               <w:start w:val="single" w:sz="2" w:space="0" w:color="DDDDDD"/>
@@ -1464,14 +1464,14 @@
         </w:tblCellMar>
       </w:tblPr>
       <w:tblGrid>
-        <w:gridCol w:w="2799"/>
-        <w:gridCol w:w="5561"/>
+        <w:gridCol w:w="2798"/>
+        <w:gridCol w:w="5562"/>
       </w:tblGrid>
       <w:tr>
         <w:trPr/>
         <w:tc>
           <w:tcPr>
-            <w:tcW w:w="2799" w:type="dxa"/>
+            <w:tcW w:w="2798" w:type="dxa"/>
             <w:tcBorders>
               <w:top w:val="single" w:sz="2" w:space="0" w:color="2E75B6"/>
               <w:start w:val="single" w:sz="2" w:space="0" w:color="2E75B6"/>
@@ -1501,7 +1501,7 @@
         </w:tc>
         <w:tc>
           <w:tcPr>
-            <w:tcW w:w="5561" w:type="dxa"/>
+            <w:tcW w:w="5562" w:type="dxa"/>
             <w:tcBorders>
               <w:top w:val="single" w:sz="2" w:space="0" w:color="2E75B6"/>
               <w:start w:val="single" w:sz="2" w:space="0" w:color="2E75B6"/>
@@ -1534,7 +1534,7 @@
         <w:trPr/>
         <w:tc>
           <w:tcPr>
-            <w:tcW w:w="2799" w:type="dxa"/>
+            <w:tcW w:w="2798" w:type="dxa"/>
             <w:tcBorders>
               <w:top w:val="single" w:sz="2" w:space="0" w:color="DDDDDD"/>
               <w:start w:val="single" w:sz="2" w:space="0" w:color="DDDDDD"/>
@@ -1563,7 +1563,7 @@
         </w:tc>
         <w:tc>
           <w:tcPr>
-            <w:tcW w:w="5561" w:type="dxa"/>
+            <w:tcW w:w="5562" w:type="dxa"/>
             <w:tcBorders>
               <w:top w:val="single" w:sz="2" w:space="0" w:color="DDDDDD"/>
               <w:start w:val="single" w:sz="2" w:space="0" w:color="DDDDDD"/>
@@ -1594,7 +1594,7 @@
         <w:trPr/>
         <w:tc>
           <w:tcPr>
-            <w:tcW w:w="2799" w:type="dxa"/>
+            <w:tcW w:w="2798" w:type="dxa"/>
             <w:tcBorders>
               <w:top w:val="single" w:sz="2" w:space="0" w:color="DDDDDD"/>
               <w:start w:val="single" w:sz="2" w:space="0" w:color="DDDDDD"/>
@@ -1634,7 +1634,7 @@
         </w:tc>
         <w:tc>
           <w:tcPr>
-            <w:tcW w:w="5561" w:type="dxa"/>
+            <w:tcW w:w="5562" w:type="dxa"/>
             <w:tcBorders>
               <w:top w:val="single" w:sz="2" w:space="0" w:color="DDDDDD"/>
               <w:start w:val="single" w:sz="2" w:space="0" w:color="DDDDDD"/>
@@ -1665,7 +1665,7 @@
         <w:trPr/>
         <w:tc>
           <w:tcPr>
-            <w:tcW w:w="2799" w:type="dxa"/>
+            <w:tcW w:w="2798" w:type="dxa"/>
             <w:tcBorders>
               <w:top w:val="single" w:sz="2" w:space="0" w:color="DDDDDD"/>
               <w:start w:val="single" w:sz="2" w:space="0" w:color="DDDDDD"/>
@@ -1705,7 +1705,7 @@
         </w:tc>
         <w:tc>
           <w:tcPr>
-            <w:tcW w:w="5561" w:type="dxa"/>
+            <w:tcW w:w="5562" w:type="dxa"/>
             <w:tcBorders>
               <w:top w:val="single" w:sz="2" w:space="0" w:color="DDDDDD"/>
               <w:start w:val="single" w:sz="2" w:space="0" w:color="DDDDDD"/>
@@ -1736,7 +1736,7 @@
         <w:trPr/>
         <w:tc>
           <w:tcPr>
-            <w:tcW w:w="2799" w:type="dxa"/>
+            <w:tcW w:w="2798" w:type="dxa"/>
             <w:tcBorders>
               <w:top w:val="single" w:sz="2" w:space="0" w:color="DDDDDD"/>
               <w:start w:val="single" w:sz="2" w:space="0" w:color="DDDDDD"/>
@@ -1776,7 +1776,7 @@
         </w:tc>
         <w:tc>
           <w:tcPr>
-            <w:tcW w:w="5561" w:type="dxa"/>
+            <w:tcW w:w="5562" w:type="dxa"/>
             <w:tcBorders>
               <w:top w:val="single" w:sz="2" w:space="0" w:color="DDDDDD"/>
               <w:start w:val="single" w:sz="2" w:space="0" w:color="DDDDDD"/>
@@ -1807,7 +1807,7 @@
         <w:trPr/>
         <w:tc>
           <w:tcPr>
-            <w:tcW w:w="2799" w:type="dxa"/>
+            <w:tcW w:w="2798" w:type="dxa"/>
             <w:tcBorders>
               <w:top w:val="single" w:sz="2" w:space="0" w:color="DDDDDD"/>
               <w:start w:val="single" w:sz="2" w:space="0" w:color="DDDDDD"/>
@@ -1847,7 +1847,7 @@
         </w:tc>
         <w:tc>
           <w:tcPr>
-            <w:tcW w:w="5561" w:type="dxa"/>
+            <w:tcW w:w="5562" w:type="dxa"/>
             <w:tcBorders>
               <w:top w:val="single" w:sz="2" w:space="0" w:color="DDDDDD"/>
               <w:start w:val="single" w:sz="2" w:space="0" w:color="DDDDDD"/>
@@ -1878,7 +1878,7 @@
         <w:trPr/>
         <w:tc>
           <w:tcPr>
-            <w:tcW w:w="2799" w:type="dxa"/>
+            <w:tcW w:w="2798" w:type="dxa"/>
             <w:tcBorders>
               <w:top w:val="single" w:sz="2" w:space="0" w:color="DDDDDD"/>
               <w:start w:val="single" w:sz="2" w:space="0" w:color="DDDDDD"/>
@@ -1918,7 +1918,7 @@
         </w:tc>
         <w:tc>
           <w:tcPr>
-            <w:tcW w:w="5561" w:type="dxa"/>
+            <w:tcW w:w="5562" w:type="dxa"/>
             <w:tcBorders>
               <w:top w:val="single" w:sz="2" w:space="0" w:color="DDDDDD"/>
               <w:start w:val="single" w:sz="2" w:space="0" w:color="DDDDDD"/>
@@ -1949,7 +1949,7 @@
         <w:trPr/>
         <w:tc>
           <w:tcPr>
-            <w:tcW w:w="2799" w:type="dxa"/>
+            <w:tcW w:w="2798" w:type="dxa"/>
             <w:tcBorders>
               <w:top w:val="single" w:sz="2" w:space="0" w:color="DDDDDD"/>
               <w:start w:val="single" w:sz="2" w:space="0" w:color="DDDDDD"/>
@@ -1989,7 +1989,7 @@
         </w:tc>
         <w:tc>
           <w:tcPr>
-            <w:tcW w:w="5561" w:type="dxa"/>
+            <w:tcW w:w="5562" w:type="dxa"/>
             <w:tcBorders>
               <w:top w:val="single" w:sz="2" w:space="0" w:color="DDDDDD"/>
               <w:start w:val="single" w:sz="2" w:space="0" w:color="DDDDDD"/>
@@ -2020,7 +2020,7 @@
         <w:trPr/>
         <w:tc>
           <w:tcPr>
-            <w:tcW w:w="2799" w:type="dxa"/>
+            <w:tcW w:w="2798" w:type="dxa"/>
             <w:tcBorders>
               <w:top w:val="single" w:sz="2" w:space="0" w:color="DDDDDD"/>
               <w:start w:val="single" w:sz="2" w:space="0" w:color="DDDDDD"/>
@@ -2060,7 +2060,7 @@
         </w:tc>
         <w:tc>
           <w:tcPr>
-            <w:tcW w:w="5561" w:type="dxa"/>
+            <w:tcW w:w="5562" w:type="dxa"/>
             <w:tcBorders>
               <w:top w:val="single" w:sz="2" w:space="0" w:color="DDDDDD"/>
               <w:start w:val="single" w:sz="2" w:space="0" w:color="DDDDDD"/>
@@ -2091,7 +2091,7 @@
         <w:trPr/>
         <w:tc>
           <w:tcPr>
-            <w:tcW w:w="2799" w:type="dxa"/>
+            <w:tcW w:w="2798" w:type="dxa"/>
             <w:tcBorders>
               <w:top w:val="single" w:sz="2" w:space="0" w:color="DDDDDD"/>
               <w:start w:val="single" w:sz="2" w:space="0" w:color="DDDDDD"/>
@@ -2131,7 +2131,7 @@
         </w:tc>
         <w:tc>
           <w:tcPr>
-            <w:tcW w:w="5561" w:type="dxa"/>
+            <w:tcW w:w="5562" w:type="dxa"/>
             <w:tcBorders>
               <w:top w:val="single" w:sz="2" w:space="0" w:color="DDDDDD"/>
               <w:start w:val="single" w:sz="2" w:space="0" w:color="DDDDDD"/>
@@ -2162,7 +2162,7 @@
         <w:trPr/>
         <w:tc>
           <w:tcPr>
-            <w:tcW w:w="2799" w:type="dxa"/>
+            <w:tcW w:w="2798" w:type="dxa"/>
             <w:tcBorders>
               <w:top w:val="single" w:sz="2" w:space="0" w:color="DDDDDD"/>
               <w:start w:val="single" w:sz="2" w:space="0" w:color="DDDDDD"/>
@@ -2202,7 +2202,7 @@
         </w:tc>
         <w:tc>
           <w:tcPr>
-            <w:tcW w:w="5561" w:type="dxa"/>
+            <w:tcW w:w="5562" w:type="dxa"/>
             <w:tcBorders>
               <w:top w:val="single" w:sz="2" w:space="0" w:color="DDDDDD"/>
               <w:start w:val="single" w:sz="2" w:space="0" w:color="DDDDDD"/>
@@ -2233,7 +2233,7 @@
         <w:trPr/>
         <w:tc>
           <w:tcPr>
-            <w:tcW w:w="2799" w:type="dxa"/>
+            <w:tcW w:w="2798" w:type="dxa"/>
             <w:tcBorders>
               <w:top w:val="single" w:sz="2" w:space="0" w:color="DDDDDD"/>
               <w:start w:val="single" w:sz="2" w:space="0" w:color="DDDDDD"/>
@@ -2273,7 +2273,7 @@
         </w:tc>
         <w:tc>
           <w:tcPr>
-            <w:tcW w:w="5561" w:type="dxa"/>
+            <w:tcW w:w="5562" w:type="dxa"/>
             <w:tcBorders>
               <w:top w:val="single" w:sz="2" w:space="0" w:color="DDDDDD"/>
               <w:start w:val="single" w:sz="2" w:space="0" w:color="DDDDDD"/>
@@ -2304,7 +2304,7 @@
         <w:trPr/>
         <w:tc>
           <w:tcPr>
-            <w:tcW w:w="2799" w:type="dxa"/>
+            <w:tcW w:w="2798" w:type="dxa"/>
             <w:tcBorders>
               <w:top w:val="single" w:sz="2" w:space="0" w:color="DDDDDD"/>
               <w:start w:val="single" w:sz="2" w:space="0" w:color="DDDDDD"/>
@@ -2344,7 +2344,7 @@
         </w:tc>
         <w:tc>
           <w:tcPr>
-            <w:tcW w:w="5561" w:type="dxa"/>
+            <w:tcW w:w="5562" w:type="dxa"/>
             <w:tcBorders>
               <w:top w:val="single" w:sz="2" w:space="0" w:color="DDDDDD"/>
               <w:start w:val="single" w:sz="2" w:space="0" w:color="DDDDDD"/>
@@ -2375,7 +2375,7 @@
         <w:trPr/>
         <w:tc>
           <w:tcPr>
-            <w:tcW w:w="2799" w:type="dxa"/>
+            <w:tcW w:w="2798" w:type="dxa"/>
             <w:tcBorders>
               <w:top w:val="single" w:sz="2" w:space="0" w:color="DDDDDD"/>
               <w:start w:val="single" w:sz="2" w:space="0" w:color="DDDDDD"/>
@@ -2415,7 +2415,7 @@
         </w:tc>
         <w:tc>
           <w:tcPr>
-            <w:tcW w:w="5561" w:type="dxa"/>
+            <w:tcW w:w="5562" w:type="dxa"/>
             <w:tcBorders>
               <w:top w:val="single" w:sz="2" w:space="0" w:color="DDDDDD"/>
               <w:start w:val="single" w:sz="2" w:space="0" w:color="DDDDDD"/>
@@ -2446,7 +2446,7 @@
         <w:trPr/>
         <w:tc>
           <w:tcPr>
-            <w:tcW w:w="2799" w:type="dxa"/>
+            <w:tcW w:w="2798" w:type="dxa"/>
             <w:tcBorders>
               <w:top w:val="single" w:sz="2" w:space="0" w:color="DDDDDD"/>
               <w:start w:val="single" w:sz="2" w:space="0" w:color="DDDDDD"/>
@@ -2486,7 +2486,7 @@
         </w:tc>
         <w:tc>
           <w:tcPr>
-            <w:tcW w:w="5561" w:type="dxa"/>
+            <w:tcW w:w="5562" w:type="dxa"/>
             <w:tcBorders>
               <w:top w:val="single" w:sz="2" w:space="0" w:color="DDDDDD"/>
               <w:start w:val="single" w:sz="2" w:space="0" w:color="DDDDDD"/>
@@ -2517,7 +2517,7 @@
         <w:trPr/>
         <w:tc>
           <w:tcPr>
-            <w:tcW w:w="2799" w:type="dxa"/>
+            <w:tcW w:w="2798" w:type="dxa"/>
             <w:tcBorders>
               <w:top w:val="single" w:sz="2" w:space="0" w:color="DDDDDD"/>
               <w:start w:val="single" w:sz="2" w:space="0" w:color="DDDDDD"/>
@@ -2557,7 +2557,7 @@
         </w:tc>
         <w:tc>
           <w:tcPr>
-            <w:tcW w:w="5561" w:type="dxa"/>
+            <w:tcW w:w="5562" w:type="dxa"/>
             <w:tcBorders>
               <w:top w:val="single" w:sz="2" w:space="0" w:color="DDDDDD"/>
               <w:start w:val="single" w:sz="2" w:space="0" w:color="DDDDDD"/>
@@ -2588,7 +2588,7 @@
         <w:trPr/>
         <w:tc>
           <w:tcPr>
-            <w:tcW w:w="2799" w:type="dxa"/>
+            <w:tcW w:w="2798" w:type="dxa"/>
             <w:tcBorders>
               <w:top w:val="single" w:sz="2" w:space="0" w:color="DDDDDD"/>
               <w:start w:val="single" w:sz="2" w:space="0" w:color="DDDDDD"/>
@@ -2628,7 +2628,7 @@
         </w:tc>
         <w:tc>
           <w:tcPr>
-            <w:tcW w:w="5561" w:type="dxa"/>
+            <w:tcW w:w="5562" w:type="dxa"/>
             <w:tcBorders>
               <w:top w:val="single" w:sz="2" w:space="0" w:color="DDDDDD"/>
               <w:start w:val="single" w:sz="2" w:space="0" w:color="DDDDDD"/>
@@ -2659,7 +2659,7 @@
         <w:trPr/>
         <w:tc>
           <w:tcPr>
-            <w:tcW w:w="2799" w:type="dxa"/>
+            <w:tcW w:w="2798" w:type="dxa"/>
             <w:tcBorders>
               <w:top w:val="single" w:sz="2" w:space="0" w:color="DDDDDD"/>
               <w:start w:val="single" w:sz="2" w:space="0" w:color="DDDDDD"/>
@@ -2699,7 +2699,7 @@
         </w:tc>
         <w:tc>
           <w:tcPr>
-            <w:tcW w:w="5561" w:type="dxa"/>
+            <w:tcW w:w="5562" w:type="dxa"/>
             <w:tcBorders>
               <w:top w:val="single" w:sz="2" w:space="0" w:color="DDDDDD"/>
               <w:start w:val="single" w:sz="2" w:space="0" w:color="DDDDDD"/>
@@ -2730,7 +2730,7 @@
         <w:trPr/>
         <w:tc>
           <w:tcPr>
-            <w:tcW w:w="2799" w:type="dxa"/>
+            <w:tcW w:w="2798" w:type="dxa"/>
             <w:tcBorders>
               <w:top w:val="single" w:sz="2" w:space="0" w:color="DDDDDD"/>
               <w:start w:val="single" w:sz="2" w:space="0" w:color="DDDDDD"/>
@@ -2770,7 +2770,7 @@
         </w:tc>
         <w:tc>
           <w:tcPr>
-            <w:tcW w:w="5561" w:type="dxa"/>
+            <w:tcW w:w="5562" w:type="dxa"/>
             <w:tcBorders>
               <w:top w:val="single" w:sz="2" w:space="0" w:color="DDDDDD"/>
               <w:start w:val="single" w:sz="2" w:space="0" w:color="DDDDDD"/>
@@ -2801,7 +2801,7 @@
         <w:trPr/>
         <w:tc>
           <w:tcPr>
-            <w:tcW w:w="2799" w:type="dxa"/>
+            <w:tcW w:w="2798" w:type="dxa"/>
             <w:tcBorders>
               <w:top w:val="single" w:sz="2" w:space="0" w:color="DDDDDD"/>
               <w:start w:val="single" w:sz="2" w:space="0" w:color="DDDDDD"/>
@@ -2841,7 +2841,7 @@
         </w:tc>
         <w:tc>
           <w:tcPr>
-            <w:tcW w:w="5561" w:type="dxa"/>
+            <w:tcW w:w="5562" w:type="dxa"/>
             <w:tcBorders>
               <w:top w:val="single" w:sz="2" w:space="0" w:color="DDDDDD"/>
               <w:start w:val="single" w:sz="2" w:space="0" w:color="DDDDDD"/>
@@ -2872,7 +2872,7 @@
         <w:trPr/>
         <w:tc>
           <w:tcPr>
-            <w:tcW w:w="2799" w:type="dxa"/>
+            <w:tcW w:w="2798" w:type="dxa"/>
             <w:tcBorders>
               <w:top w:val="single" w:sz="2" w:space="0" w:color="DDDDDD"/>
               <w:start w:val="single" w:sz="2" w:space="0" w:color="DDDDDD"/>
@@ -2912,7 +2912,7 @@
         </w:tc>
         <w:tc>
           <w:tcPr>
-            <w:tcW w:w="5561" w:type="dxa"/>
+            <w:tcW w:w="5562" w:type="dxa"/>
             <w:tcBorders>
               <w:top w:val="single" w:sz="2" w:space="0" w:color="DDDDDD"/>
               <w:start w:val="single" w:sz="2" w:space="0" w:color="DDDDDD"/>
@@ -2943,7 +2943,7 @@
         <w:trPr/>
         <w:tc>
           <w:tcPr>
-            <w:tcW w:w="2799" w:type="dxa"/>
+            <w:tcW w:w="2798" w:type="dxa"/>
             <w:tcBorders>
               <w:top w:val="single" w:sz="2" w:space="0" w:color="DDDDDD"/>
               <w:start w:val="single" w:sz="2" w:space="0" w:color="DDDDDD"/>
@@ -2983,7 +2983,7 @@
         </w:tc>
         <w:tc>
           <w:tcPr>
-            <w:tcW w:w="5561" w:type="dxa"/>
+            <w:tcW w:w="5562" w:type="dxa"/>
             <w:tcBorders>
               <w:top w:val="single" w:sz="2" w:space="0" w:color="DDDDDD"/>
               <w:start w:val="single" w:sz="2" w:space="0" w:color="DDDDDD"/>
@@ -3014,7 +3014,7 @@
         <w:trPr/>
         <w:tc>
           <w:tcPr>
-            <w:tcW w:w="2799" w:type="dxa"/>
+            <w:tcW w:w="2798" w:type="dxa"/>
             <w:tcBorders>
               <w:top w:val="single" w:sz="2" w:space="0" w:color="DDDDDD"/>
               <w:start w:val="single" w:sz="2" w:space="0" w:color="DDDDDD"/>
@@ -3054,7 +3054,7 @@
         </w:tc>
         <w:tc>
           <w:tcPr>
-            <w:tcW w:w="5561" w:type="dxa"/>
+            <w:tcW w:w="5562" w:type="dxa"/>
             <w:tcBorders>
               <w:top w:val="single" w:sz="2" w:space="0" w:color="DDDDDD"/>
               <w:start w:val="single" w:sz="2" w:space="0" w:color="DDDDDD"/>
@@ -3085,7 +3085,7 @@
         <w:trPr/>
         <w:tc>
           <w:tcPr>
-            <w:tcW w:w="2799" w:type="dxa"/>
+            <w:tcW w:w="2798" w:type="dxa"/>
             <w:tcBorders>
               <w:top w:val="single" w:sz="2" w:space="0" w:color="DDDDDD"/>
               <w:start w:val="single" w:sz="2" w:space="0" w:color="DDDDDD"/>
@@ -3125,7 +3125,7 @@
         </w:tc>
         <w:tc>
           <w:tcPr>
-            <w:tcW w:w="5561" w:type="dxa"/>
+            <w:tcW w:w="5562" w:type="dxa"/>
             <w:tcBorders>
               <w:top w:val="single" w:sz="2" w:space="0" w:color="DDDDDD"/>
               <w:start w:val="single" w:sz="2" w:space="0" w:color="DDDDDD"/>
@@ -3156,7 +3156,7 @@
         <w:trPr/>
         <w:tc>
           <w:tcPr>
-            <w:tcW w:w="2799" w:type="dxa"/>
+            <w:tcW w:w="2798" w:type="dxa"/>
             <w:tcBorders>
               <w:top w:val="single" w:sz="2" w:space="0" w:color="DDDDDD"/>
               <w:start w:val="single" w:sz="2" w:space="0" w:color="DDDDDD"/>
@@ -3196,7 +3196,7 @@
         </w:tc>
         <w:tc>
           <w:tcPr>
-            <w:tcW w:w="5561" w:type="dxa"/>
+            <w:tcW w:w="5562" w:type="dxa"/>
             <w:tcBorders>
               <w:top w:val="single" w:sz="2" w:space="0" w:color="DDDDDD"/>
               <w:start w:val="single" w:sz="2" w:space="0" w:color="DDDDDD"/>
@@ -3227,7 +3227,7 @@
         <w:trPr/>
         <w:tc>
           <w:tcPr>
-            <w:tcW w:w="2799" w:type="dxa"/>
+            <w:tcW w:w="2798" w:type="dxa"/>
             <w:tcBorders>
               <w:top w:val="single" w:sz="2" w:space="0" w:color="DDDDDD"/>
               <w:start w:val="single" w:sz="2" w:space="0" w:color="DDDDDD"/>
@@ -3267,7 +3267,7 @@
         </w:tc>
         <w:tc>
           <w:tcPr>
-            <w:tcW w:w="5561" w:type="dxa"/>
+            <w:tcW w:w="5562" w:type="dxa"/>
             <w:tcBorders>
               <w:top w:val="single" w:sz="2" w:space="0" w:color="DDDDDD"/>
               <w:start w:val="single" w:sz="2" w:space="0" w:color="DDDDDD"/>
@@ -3440,7 +3440,7 @@
         <w:pStyle w:val="ListParagraph"/>
         <w:numPr>
           <w:ilvl w:val="0"/>
-          <w:numId w:val="3"/>
+          <w:numId w:val="4"/>
         </w:numPr>
         <w:spacing w:before="0" w:after="60"/>
         <w:rPr/>
@@ -3460,7 +3460,7 @@
         <w:pStyle w:val="ListParagraph"/>
         <w:numPr>
           <w:ilvl w:val="0"/>
-          <w:numId w:val="1"/>
+          <w:numId w:val="2"/>
         </w:numPr>
         <w:spacing w:before="0" w:after="60"/>
         <w:rPr/>
@@ -3480,7 +3480,7 @@
         <w:pStyle w:val="ListParagraph"/>
         <w:numPr>
           <w:ilvl w:val="0"/>
-          <w:numId w:val="1"/>
+          <w:numId w:val="2"/>
         </w:numPr>
         <w:spacing w:before="0" w:after="60"/>
         <w:rPr/>
@@ -3500,7 +3500,7 @@
         <w:pStyle w:val="ListParagraph"/>
         <w:numPr>
           <w:ilvl w:val="0"/>
-          <w:numId w:val="1"/>
+          <w:numId w:val="2"/>
         </w:numPr>
         <w:spacing w:before="0" w:after="60"/>
         <w:rPr/>
@@ -3855,7 +3855,7 @@
         <w:pStyle w:val="ListParagraph"/>
         <w:numPr>
           <w:ilvl w:val="0"/>
-          <w:numId w:val="1"/>
+          <w:numId w:val="2"/>
         </w:numPr>
         <w:spacing w:before="0" w:after="60"/>
         <w:rPr/>
@@ -3875,7 +3875,7 @@
         <w:pStyle w:val="ListParagraph"/>
         <w:numPr>
           <w:ilvl w:val="0"/>
-          <w:numId w:val="1"/>
+          <w:numId w:val="2"/>
         </w:numPr>
         <w:spacing w:before="0" w:after="60"/>
         <w:rPr/>
@@ -3895,7 +3895,7 @@
         <w:pStyle w:val="ListParagraph"/>
         <w:numPr>
           <w:ilvl w:val="0"/>
-          <w:numId w:val="1"/>
+          <w:numId w:val="2"/>
         </w:numPr>
         <w:spacing w:before="0" w:after="60"/>
         <w:rPr/>
@@ -3915,7 +3915,7 @@
         <w:pStyle w:val="ListParagraph"/>
         <w:numPr>
           <w:ilvl w:val="0"/>
-          <w:numId w:val="1"/>
+          <w:numId w:val="2"/>
         </w:numPr>
         <w:spacing w:before="0" w:after="60"/>
         <w:rPr/>
@@ -3935,7 +3935,7 @@
         <w:pStyle w:val="ListParagraph"/>
         <w:numPr>
           <w:ilvl w:val="0"/>
-          <w:numId w:val="1"/>
+          <w:numId w:val="2"/>
         </w:numPr>
         <w:spacing w:before="0" w:after="60"/>
         <w:rPr/>
@@ -3955,7 +3955,7 @@
         <w:pStyle w:val="ListParagraph"/>
         <w:numPr>
           <w:ilvl w:val="0"/>
-          <w:numId w:val="1"/>
+          <w:numId w:val="2"/>
         </w:numPr>
         <w:spacing w:before="0" w:after="60"/>
         <w:rPr/>
@@ -4533,7 +4533,7 @@
         <w:pStyle w:val="ListParagraph"/>
         <w:numPr>
           <w:ilvl w:val="0"/>
-          <w:numId w:val="1"/>
+          <w:numId w:val="2"/>
         </w:numPr>
         <w:spacing w:before="0" w:after="60"/>
         <w:rPr/>
@@ -4553,7 +4553,7 @@
         <w:pStyle w:val="ListParagraph"/>
         <w:numPr>
           <w:ilvl w:val="0"/>
-          <w:numId w:val="1"/>
+          <w:numId w:val="2"/>
         </w:numPr>
         <w:spacing w:before="0" w:after="60"/>
         <w:rPr/>
@@ -4573,7 +4573,7 @@
         <w:pStyle w:val="ListParagraph"/>
         <w:numPr>
           <w:ilvl w:val="0"/>
-          <w:numId w:val="1"/>
+          <w:numId w:val="2"/>
         </w:numPr>
         <w:spacing w:before="0" w:after="60"/>
         <w:rPr/>
@@ -4773,7 +4773,7 @@
         <w:pStyle w:val="ListParagraph"/>
         <w:numPr>
           <w:ilvl w:val="0"/>
-          <w:numId w:val="1"/>
+          <w:numId w:val="2"/>
         </w:numPr>
         <w:spacing w:before="0" w:after="60"/>
         <w:rPr/>
@@ -4793,7 +4793,7 @@
         <w:pStyle w:val="ListParagraph"/>
         <w:numPr>
           <w:ilvl w:val="0"/>
-          <w:numId w:val="1"/>
+          <w:numId w:val="2"/>
         </w:numPr>
         <w:spacing w:before="0" w:after="60"/>
         <w:rPr/>
@@ -4813,7 +4813,7 @@
         <w:pStyle w:val="ListParagraph"/>
         <w:numPr>
           <w:ilvl w:val="0"/>
-          <w:numId w:val="1"/>
+          <w:numId w:val="2"/>
         </w:numPr>
         <w:spacing w:before="0" w:after="60"/>
         <w:rPr/>
@@ -4833,7 +4833,7 @@
         <w:pStyle w:val="ListParagraph"/>
         <w:numPr>
           <w:ilvl w:val="0"/>
-          <w:numId w:val="1"/>
+          <w:numId w:val="2"/>
         </w:numPr>
         <w:spacing w:before="0" w:after="60"/>
         <w:rPr/>
@@ -4853,7 +4853,7 @@
         <w:pStyle w:val="ListParagraph"/>
         <w:numPr>
           <w:ilvl w:val="0"/>
-          <w:numId w:val="1"/>
+          <w:numId w:val="2"/>
         </w:numPr>
         <w:spacing w:before="0" w:after="60"/>
         <w:rPr/>
@@ -4873,7 +4873,7 @@
         <w:pStyle w:val="ListParagraph"/>
         <w:numPr>
           <w:ilvl w:val="0"/>
-          <w:numId w:val="1"/>
+          <w:numId w:val="2"/>
         </w:numPr>
         <w:spacing w:before="0" w:after="60"/>
         <w:rPr/>
@@ -4893,7 +4893,7 @@
         <w:pStyle w:val="ListParagraph"/>
         <w:numPr>
           <w:ilvl w:val="0"/>
-          <w:numId w:val="1"/>
+          <w:numId w:val="2"/>
         </w:numPr>
         <w:spacing w:before="0" w:after="60"/>
         <w:rPr/>
@@ -5421,7 +5421,7 @@
         <w:pStyle w:val="ListParagraph"/>
         <w:numPr>
           <w:ilvl w:val="0"/>
-          <w:numId w:val="1"/>
+          <w:numId w:val="2"/>
         </w:numPr>
         <w:spacing w:before="0" w:after="60"/>
         <w:rPr/>
@@ -5441,7 +5441,7 @@
         <w:pStyle w:val="ListParagraph"/>
         <w:numPr>
           <w:ilvl w:val="0"/>
-          <w:numId w:val="1"/>
+          <w:numId w:val="2"/>
         </w:numPr>
         <w:spacing w:before="0" w:after="60"/>
         <w:rPr/>
@@ -5461,7 +5461,7 @@
         <w:pStyle w:val="ListParagraph"/>
         <w:numPr>
           <w:ilvl w:val="0"/>
-          <w:numId w:val="1"/>
+          <w:numId w:val="2"/>
         </w:numPr>
         <w:spacing w:before="0" w:after="60"/>
         <w:rPr/>
@@ -5661,7 +5661,7 @@
         <w:pStyle w:val="ListParagraph"/>
         <w:numPr>
           <w:ilvl w:val="0"/>
-          <w:numId w:val="1"/>
+          <w:numId w:val="2"/>
         </w:numPr>
         <w:spacing w:before="0" w:after="60"/>
         <w:rPr/>
@@ -5681,7 +5681,7 @@
         <w:pStyle w:val="ListParagraph"/>
         <w:numPr>
           <w:ilvl w:val="0"/>
-          <w:numId w:val="1"/>
+          <w:numId w:val="2"/>
         </w:numPr>
         <w:spacing w:before="0" w:after="60"/>
         <w:rPr/>
@@ -5701,7 +5701,7 @@
         <w:pStyle w:val="ListParagraph"/>
         <w:numPr>
           <w:ilvl w:val="0"/>
-          <w:numId w:val="1"/>
+          <w:numId w:val="2"/>
         </w:numPr>
         <w:spacing w:before="0" w:after="60"/>
         <w:rPr/>
@@ -5721,7 +5721,7 @@
         <w:pStyle w:val="ListParagraph"/>
         <w:numPr>
           <w:ilvl w:val="0"/>
-          <w:numId w:val="1"/>
+          <w:numId w:val="2"/>
         </w:numPr>
         <w:spacing w:before="0" w:after="60"/>
         <w:rPr/>
@@ -5741,7 +5741,7 @@
         <w:pStyle w:val="ListParagraph"/>
         <w:numPr>
           <w:ilvl w:val="0"/>
-          <w:numId w:val="1"/>
+          <w:numId w:val="2"/>
         </w:numPr>
         <w:spacing w:before="0" w:after="60"/>
         <w:rPr/>
@@ -5761,7 +5761,7 @@
         <w:pStyle w:val="ListParagraph"/>
         <w:numPr>
           <w:ilvl w:val="0"/>
-          <w:numId w:val="1"/>
+          <w:numId w:val="2"/>
         </w:numPr>
         <w:spacing w:before="0" w:after="60"/>
         <w:rPr/>
@@ -6302,7 +6302,7 @@
         <w:pStyle w:val="ListParagraph"/>
         <w:numPr>
           <w:ilvl w:val="0"/>
-          <w:numId w:val="1"/>
+          <w:numId w:val="2"/>
         </w:numPr>
         <w:spacing w:before="0" w:after="60"/>
         <w:rPr/>
@@ -6322,7 +6322,7 @@
         <w:pStyle w:val="ListParagraph"/>
         <w:numPr>
           <w:ilvl w:val="0"/>
-          <w:numId w:val="1"/>
+          <w:numId w:val="2"/>
         </w:numPr>
         <w:spacing w:before="0" w:after="60"/>
         <w:rPr/>
@@ -6342,7 +6342,7 @@
         <w:pStyle w:val="ListParagraph"/>
         <w:numPr>
           <w:ilvl w:val="0"/>
-          <w:numId w:val="1"/>
+          <w:numId w:val="2"/>
         </w:numPr>
         <w:spacing w:before="0" w:after="60"/>
         <w:rPr/>
@@ -6573,7 +6573,7 @@
         <w:pStyle w:val="ListParagraph"/>
         <w:numPr>
           <w:ilvl w:val="0"/>
-          <w:numId w:val="1"/>
+          <w:numId w:val="2"/>
         </w:numPr>
         <w:spacing w:before="0" w:after="60"/>
         <w:rPr/>
@@ -6593,7 +6593,7 @@
         <w:pStyle w:val="ListParagraph"/>
         <w:numPr>
           <w:ilvl w:val="0"/>
-          <w:numId w:val="1"/>
+          <w:numId w:val="2"/>
         </w:numPr>
         <w:spacing w:before="0" w:after="60"/>
         <w:rPr/>
@@ -6613,7 +6613,7 @@
         <w:pStyle w:val="ListParagraph"/>
         <w:numPr>
           <w:ilvl w:val="0"/>
-          <w:numId w:val="1"/>
+          <w:numId w:val="2"/>
         </w:numPr>
         <w:spacing w:before="0" w:after="60"/>
         <w:rPr/>
@@ -6633,7 +6633,7 @@
         <w:pStyle w:val="ListParagraph"/>
         <w:numPr>
           <w:ilvl w:val="0"/>
-          <w:numId w:val="1"/>
+          <w:numId w:val="2"/>
         </w:numPr>
         <w:spacing w:before="0" w:after="60"/>
         <w:rPr/>
@@ -6653,7 +6653,7 @@
         <w:pStyle w:val="ListParagraph"/>
         <w:numPr>
           <w:ilvl w:val="0"/>
-          <w:numId w:val="1"/>
+          <w:numId w:val="2"/>
         </w:numPr>
         <w:spacing w:before="0" w:after="60"/>
         <w:rPr/>
@@ -6673,7 +6673,7 @@
         <w:pStyle w:val="ListParagraph"/>
         <w:numPr>
           <w:ilvl w:val="0"/>
-          <w:numId w:val="1"/>
+          <w:numId w:val="2"/>
         </w:numPr>
         <w:spacing w:before="0" w:after="60"/>
         <w:rPr/>
@@ -6693,7 +6693,7 @@
         <w:pStyle w:val="ListParagraph"/>
         <w:numPr>
           <w:ilvl w:val="0"/>
-          <w:numId w:val="1"/>
+          <w:numId w:val="2"/>
         </w:numPr>
         <w:spacing w:before="0" w:after="60"/>
         <w:rPr/>
@@ -7271,7 +7271,7 @@
         <w:pStyle w:val="ListParagraph"/>
         <w:numPr>
           <w:ilvl w:val="0"/>
-          <w:numId w:val="1"/>
+          <w:numId w:val="2"/>
         </w:numPr>
         <w:spacing w:before="0" w:after="60"/>
         <w:rPr/>
@@ -7291,7 +7291,7 @@
         <w:pStyle w:val="ListParagraph"/>
         <w:numPr>
           <w:ilvl w:val="0"/>
-          <w:numId w:val="1"/>
+          <w:numId w:val="2"/>
         </w:numPr>
         <w:spacing w:before="0" w:after="60"/>
         <w:rPr/>
@@ -7311,7 +7311,7 @@
         <w:pStyle w:val="ListParagraph"/>
         <w:numPr>
           <w:ilvl w:val="0"/>
-          <w:numId w:val="1"/>
+          <w:numId w:val="2"/>
         </w:numPr>
         <w:spacing w:before="0" w:after="60"/>
         <w:rPr/>
@@ -7542,7 +7542,7 @@
         <w:pStyle w:val="ListParagraph"/>
         <w:numPr>
           <w:ilvl w:val="0"/>
-          <w:numId w:val="1"/>
+          <w:numId w:val="2"/>
         </w:numPr>
         <w:spacing w:before="0" w:after="60"/>
         <w:rPr/>
@@ -7562,7 +7562,7 @@
         <w:pStyle w:val="ListParagraph"/>
         <w:numPr>
           <w:ilvl w:val="0"/>
-          <w:numId w:val="1"/>
+          <w:numId w:val="2"/>
         </w:numPr>
         <w:spacing w:before="0" w:after="60"/>
         <w:rPr/>
@@ -7582,7 +7582,7 @@
         <w:pStyle w:val="ListParagraph"/>
         <w:numPr>
           <w:ilvl w:val="0"/>
-          <w:numId w:val="1"/>
+          <w:numId w:val="2"/>
         </w:numPr>
         <w:spacing w:before="0" w:after="60"/>
         <w:rPr/>
@@ -7602,7 +7602,7 @@
         <w:pStyle w:val="ListParagraph"/>
         <w:numPr>
           <w:ilvl w:val="0"/>
-          <w:numId w:val="1"/>
+          <w:numId w:val="2"/>
         </w:numPr>
         <w:spacing w:before="0" w:after="60"/>
         <w:rPr/>
@@ -7622,7 +7622,7 @@
         <w:pStyle w:val="ListParagraph"/>
         <w:numPr>
           <w:ilvl w:val="0"/>
-          <w:numId w:val="1"/>
+          <w:numId w:val="2"/>
         </w:numPr>
         <w:spacing w:before="0" w:after="60"/>
         <w:rPr/>
@@ -7642,7 +7642,7 @@
         <w:pStyle w:val="ListParagraph"/>
         <w:numPr>
           <w:ilvl w:val="0"/>
-          <w:numId w:val="1"/>
+          <w:numId w:val="2"/>
         </w:numPr>
         <w:spacing w:before="0" w:after="60"/>
         <w:rPr/>
@@ -7662,7 +7662,7 @@
         <w:pStyle w:val="ListParagraph"/>
         <w:numPr>
           <w:ilvl w:val="0"/>
-          <w:numId w:val="1"/>
+          <w:numId w:val="2"/>
         </w:numPr>
         <w:spacing w:before="0" w:after="60"/>
         <w:rPr/>
@@ -8249,7 +8249,7 @@
         <w:pStyle w:val="ListParagraph"/>
         <w:numPr>
           <w:ilvl w:val="0"/>
-          <w:numId w:val="1"/>
+          <w:numId w:val="2"/>
         </w:numPr>
         <w:spacing w:before="0" w:after="60"/>
         <w:rPr/>
@@ -8269,7 +8269,7 @@
         <w:pStyle w:val="ListParagraph"/>
         <w:numPr>
           <w:ilvl w:val="0"/>
-          <w:numId w:val="1"/>
+          <w:numId w:val="2"/>
         </w:numPr>
         <w:spacing w:before="0" w:after="60"/>
         <w:rPr/>
@@ -8289,7 +8289,7 @@
         <w:pStyle w:val="ListParagraph"/>
         <w:numPr>
           <w:ilvl w:val="0"/>
-          <w:numId w:val="1"/>
+          <w:numId w:val="2"/>
         </w:numPr>
         <w:spacing w:before="0" w:after="60"/>
         <w:rPr/>
@@ -8309,7 +8309,7 @@
         <w:pStyle w:val="ListParagraph"/>
         <w:numPr>
           <w:ilvl w:val="0"/>
-          <w:numId w:val="1"/>
+          <w:numId w:val="2"/>
         </w:numPr>
         <w:spacing w:before="0" w:after="60"/>
         <w:rPr/>
@@ -8757,7 +8757,7 @@
         <w:pStyle w:val="ListParagraph"/>
         <w:numPr>
           <w:ilvl w:val="0"/>
-          <w:numId w:val="1"/>
+          <w:numId w:val="2"/>
         </w:numPr>
         <w:spacing w:before="0" w:after="60"/>
         <w:rPr/>
@@ -8777,7 +8777,7 @@
         <w:pStyle w:val="ListParagraph"/>
         <w:numPr>
           <w:ilvl w:val="0"/>
-          <w:numId w:val="1"/>
+          <w:numId w:val="2"/>
         </w:numPr>
         <w:spacing w:before="0" w:after="60"/>
         <w:rPr/>
@@ -8797,7 +8797,7 @@
         <w:pStyle w:val="ListParagraph"/>
         <w:numPr>
           <w:ilvl w:val="0"/>
-          <w:numId w:val="1"/>
+          <w:numId w:val="2"/>
         </w:numPr>
         <w:spacing w:before="0" w:after="60"/>
         <w:rPr/>
@@ -8817,7 +8817,7 @@
         <w:pStyle w:val="ListParagraph"/>
         <w:numPr>
           <w:ilvl w:val="0"/>
-          <w:numId w:val="1"/>
+          <w:numId w:val="2"/>
         </w:numPr>
         <w:spacing w:before="0" w:after="60"/>
         <w:rPr/>
@@ -8837,7 +8837,7 @@
         <w:pStyle w:val="ListParagraph"/>
         <w:numPr>
           <w:ilvl w:val="0"/>
-          <w:numId w:val="1"/>
+          <w:numId w:val="2"/>
         </w:numPr>
         <w:spacing w:before="0" w:after="60"/>
         <w:rPr/>
@@ -8857,7 +8857,7 @@
         <w:pStyle w:val="ListParagraph"/>
         <w:numPr>
           <w:ilvl w:val="0"/>
-          <w:numId w:val="1"/>
+          <w:numId w:val="2"/>
         </w:numPr>
         <w:spacing w:before="0" w:after="60"/>
         <w:rPr/>
@@ -8877,7 +8877,7 @@
         <w:pStyle w:val="ListParagraph"/>
         <w:numPr>
           <w:ilvl w:val="0"/>
-          <w:numId w:val="1"/>
+          <w:numId w:val="2"/>
         </w:numPr>
         <w:spacing w:before="0" w:after="60"/>
         <w:rPr/>
@@ -8897,7 +8897,7 @@
         <w:pStyle w:val="ListParagraph"/>
         <w:numPr>
           <w:ilvl w:val="0"/>
-          <w:numId w:val="1"/>
+          <w:numId w:val="2"/>
         </w:numPr>
         <w:spacing w:before="0" w:after="60"/>
         <w:rPr/>
@@ -8917,7 +8917,7 @@
         <w:pStyle w:val="ListParagraph"/>
         <w:numPr>
           <w:ilvl w:val="0"/>
-          <w:numId w:val="1"/>
+          <w:numId w:val="2"/>
         </w:numPr>
         <w:spacing w:before="0" w:after="60"/>
         <w:rPr/>
@@ -8937,7 +8937,7 @@
         <w:pStyle w:val="ListParagraph"/>
         <w:numPr>
           <w:ilvl w:val="0"/>
-          <w:numId w:val="1"/>
+          <w:numId w:val="2"/>
         </w:numPr>
         <w:spacing w:before="0" w:after="60"/>
         <w:rPr/>
@@ -9764,7 +9764,7 @@
         <w:pStyle w:val="ListParagraph"/>
         <w:numPr>
           <w:ilvl w:val="0"/>
-          <w:numId w:val="1"/>
+          <w:numId w:val="2"/>
         </w:numPr>
         <w:spacing w:before="0" w:after="60"/>
         <w:rPr/>
@@ -9784,7 +9784,7 @@
         <w:pStyle w:val="ListParagraph"/>
         <w:numPr>
           <w:ilvl w:val="0"/>
-          <w:numId w:val="1"/>
+          <w:numId w:val="2"/>
         </w:numPr>
         <w:spacing w:before="0" w:after="60"/>
         <w:rPr/>
@@ -9804,7 +9804,7 @@
         <w:pStyle w:val="ListParagraph"/>
         <w:numPr>
           <w:ilvl w:val="0"/>
-          <w:numId w:val="1"/>
+          <w:numId w:val="2"/>
         </w:numPr>
         <w:spacing w:before="0" w:after="60"/>
         <w:rPr/>
@@ -10035,7 +10035,7 @@
         <w:pStyle w:val="ListParagraph"/>
         <w:numPr>
           <w:ilvl w:val="0"/>
-          <w:numId w:val="1"/>
+          <w:numId w:val="2"/>
         </w:numPr>
         <w:spacing w:before="0" w:after="60"/>
         <w:rPr/>
@@ -10055,7 +10055,7 @@
         <w:pStyle w:val="ListParagraph"/>
         <w:numPr>
           <w:ilvl w:val="0"/>
-          <w:numId w:val="1"/>
+          <w:numId w:val="2"/>
         </w:numPr>
         <w:spacing w:before="0" w:after="60"/>
         <w:rPr/>
@@ -10075,7 +10075,7 @@
         <w:pStyle w:val="ListParagraph"/>
         <w:numPr>
           <w:ilvl w:val="0"/>
-          <w:numId w:val="1"/>
+          <w:numId w:val="2"/>
         </w:numPr>
         <w:spacing w:before="0" w:after="60"/>
         <w:rPr/>
@@ -10095,7 +10095,7 @@
         <w:pStyle w:val="ListParagraph"/>
         <w:numPr>
           <w:ilvl w:val="0"/>
-          <w:numId w:val="1"/>
+          <w:numId w:val="2"/>
         </w:numPr>
         <w:spacing w:before="0" w:after="60"/>
         <w:rPr/>
@@ -10115,7 +10115,7 @@
         <w:pStyle w:val="ListParagraph"/>
         <w:numPr>
           <w:ilvl w:val="0"/>
-          <w:numId w:val="1"/>
+          <w:numId w:val="2"/>
         </w:numPr>
         <w:spacing w:before="0" w:after="60"/>
         <w:rPr/>
@@ -10135,7 +10135,7 @@
         <w:pStyle w:val="ListParagraph"/>
         <w:numPr>
           <w:ilvl w:val="0"/>
-          <w:numId w:val="1"/>
+          <w:numId w:val="2"/>
         </w:numPr>
         <w:spacing w:before="0" w:after="60"/>
         <w:rPr/>
@@ -10155,7 +10155,7 @@
         <w:pStyle w:val="ListParagraph"/>
         <w:numPr>
           <w:ilvl w:val="0"/>
-          <w:numId w:val="1"/>
+          <w:numId w:val="2"/>
         </w:numPr>
         <w:spacing w:before="0" w:after="60"/>
         <w:rPr/>
@@ -10175,7 +10175,7 @@
         <w:pStyle w:val="ListParagraph"/>
         <w:numPr>
           <w:ilvl w:val="0"/>
-          <w:numId w:val="1"/>
+          <w:numId w:val="2"/>
         </w:numPr>
         <w:spacing w:before="0" w:after="60"/>
         <w:rPr/>
@@ -10666,8 +10666,8 @@
         </w:tblCellMar>
       </w:tblPr>
       <w:tblGrid>
-        <w:gridCol w:w="1199"/>
-        <w:gridCol w:w="2801"/>
+        <w:gridCol w:w="1198"/>
+        <w:gridCol w:w="2802"/>
         <w:gridCol w:w="1800"/>
         <w:gridCol w:w="2560"/>
       </w:tblGrid>
@@ -10675,7 +10675,7 @@
         <w:trPr/>
         <w:tc>
           <w:tcPr>
-            <w:tcW w:w="1199" w:type="dxa"/>
+            <w:tcW w:w="1198" w:type="dxa"/>
             <w:tcBorders>
               <w:top w:val="single" w:sz="2" w:space="0" w:color="2E75B6"/>
               <w:start w:val="single" w:sz="2" w:space="0" w:color="2E75B6"/>
@@ -10705,7 +10705,7 @@
         </w:tc>
         <w:tc>
           <w:tcPr>
-            <w:tcW w:w="2801" w:type="dxa"/>
+            <w:tcW w:w="2802" w:type="dxa"/>
             <w:tcBorders>
               <w:top w:val="single" w:sz="2" w:space="0" w:color="2E75B6"/>
               <w:start w:val="single" w:sz="2" w:space="0" w:color="2E75B6"/>
@@ -10798,7 +10798,7 @@
         <w:trPr/>
         <w:tc>
           <w:tcPr>
-            <w:tcW w:w="1199" w:type="dxa"/>
+            <w:tcW w:w="1198" w:type="dxa"/>
             <w:tcBorders>
               <w:top w:val="single" w:sz="2" w:space="0" w:color="DDDDDD"/>
               <w:start w:val="single" w:sz="2" w:space="0" w:color="DDDDDD"/>
@@ -10826,7 +10826,7 @@
         </w:tc>
         <w:tc>
           <w:tcPr>
-            <w:tcW w:w="2801" w:type="dxa"/>
+            <w:tcW w:w="2802" w:type="dxa"/>
             <w:tcBorders>
               <w:top w:val="single" w:sz="2" w:space="0" w:color="DDDDDD"/>
               <w:start w:val="single" w:sz="2" w:space="0" w:color="DDDDDD"/>
@@ -10922,7 +10922,7 @@
         <w:trPr/>
         <w:tc>
           <w:tcPr>
-            <w:tcW w:w="1199" w:type="dxa"/>
+            <w:tcW w:w="1198" w:type="dxa"/>
             <w:tcBorders>
               <w:top w:val="single" w:sz="2" w:space="0" w:color="DDDDDD"/>
               <w:start w:val="single" w:sz="2" w:space="0" w:color="DDDDDD"/>
@@ -10950,7 +10950,7 @@
         </w:tc>
         <w:tc>
           <w:tcPr>
-            <w:tcW w:w="2801" w:type="dxa"/>
+            <w:tcW w:w="2802" w:type="dxa"/>
             <w:tcBorders>
               <w:top w:val="single" w:sz="2" w:space="0" w:color="DDDDDD"/>
               <w:start w:val="single" w:sz="2" w:space="0" w:color="DDDDDD"/>
@@ -11017,6 +11017,74 @@
           </w:tcPr>
           <w:p>
             <w:pPr>
+              <w:pStyle w:val="ListParagraph"/>
+              <w:spacing w:before="0" w:after="60"/>
+              <w:rPr/>
+            </w:pPr>
+            <w:r>
+              <w:rPr>
+                <w:rFonts w:eastAsia="Arial" w:cs="Arial"/>
+                <w:color w:val="1A1A1A"/>
+                <w:sz w:val="20"/>
+                <w:szCs w:val="20"/>
+              </w:rPr>
+              <w:t xml:space="preserve">✅ </w:t>
+            </w:r>
+            <w:r>
+              <w:rPr>
+                <w:rFonts w:eastAsia="Arial" w:cs="Arial"/>
+                <w:color w:val="1A1A1A"/>
+                <w:sz w:val="20"/>
+                <w:szCs w:val="20"/>
+              </w:rPr>
+              <w:t>Completo</w:t>
+            </w:r>
+          </w:p>
+        </w:tc>
+      </w:tr>
+      <w:tr>
+        <w:trPr/>
+        <w:tc>
+          <w:tcPr>
+            <w:tcW w:w="1198" w:type="dxa"/>
+            <w:tcBorders>
+              <w:top w:val="single" w:sz="2" w:space="0" w:color="DDDDDD"/>
+              <w:start w:val="single" w:sz="2" w:space="0" w:color="DDDDDD"/>
+              <w:bottom w:val="single" w:sz="2" w:space="0" w:color="DDDDDD"/>
+              <w:end w:val="single" w:sz="2" w:space="0" w:color="DDDDDD"/>
+            </w:tcBorders>
+            <w:shd w:fill="F2F2F2" w:val="clear"/>
+          </w:tcPr>
+          <w:p>
+            <w:pPr>
+              <w:pStyle w:val="Normal"/>
+              <w:jc w:val="center"/>
+              <w:rPr/>
+            </w:pPr>
+            <w:r>
+              <w:rPr>
+                <w:rFonts w:eastAsia="Arial" w:cs="Arial"/>
+                <w:color w:val="1A1A1A"/>
+                <w:sz w:val="18"/>
+                <w:szCs w:val="18"/>
+              </w:rPr>
+              <w:t>3</w:t>
+            </w:r>
+          </w:p>
+        </w:tc>
+        <w:tc>
+          <w:tcPr>
+            <w:tcW w:w="2802" w:type="dxa"/>
+            <w:tcBorders>
+              <w:top w:val="single" w:sz="2" w:space="0" w:color="DDDDDD"/>
+              <w:start w:val="single" w:sz="2" w:space="0" w:color="DDDDDD"/>
+              <w:bottom w:val="single" w:sz="2" w:space="0" w:color="DDDDDD"/>
+              <w:end w:val="single" w:sz="2" w:space="0" w:color="DDDDDD"/>
+            </w:tcBorders>
+            <w:shd w:fill="F2F2F2" w:val="clear"/>
+          </w:tcPr>
+          <w:p>
+            <w:pPr>
               <w:pStyle w:val="Normal"/>
               <w:jc w:val="start"/>
               <w:rPr/>
@@ -11028,6 +11096,62 @@
                 <w:sz w:val="18"/>
                 <w:szCs w:val="18"/>
               </w:rPr>
+              <w:t>Etapa 3: Procesamiento Python/Pandas</w:t>
+            </w:r>
+          </w:p>
+        </w:tc>
+        <w:tc>
+          <w:tcPr>
+            <w:tcW w:w="1800" w:type="dxa"/>
+            <w:tcBorders>
+              <w:top w:val="single" w:sz="2" w:space="0" w:color="DDDDDD"/>
+              <w:start w:val="single" w:sz="2" w:space="0" w:color="DDDDDD"/>
+              <w:bottom w:val="single" w:sz="2" w:space="0" w:color="DDDDDD"/>
+              <w:end w:val="single" w:sz="2" w:space="0" w:color="DDDDDD"/>
+            </w:tcBorders>
+            <w:shd w:fill="F2F2F2" w:val="clear"/>
+          </w:tcPr>
+          <w:p>
+            <w:pPr>
+              <w:pStyle w:val="Normal"/>
+              <w:jc w:val="center"/>
+              <w:rPr/>
+            </w:pPr>
+            <w:r>
+              <w:rPr>
+                <w:rFonts w:eastAsia="Arial" w:cs="Arial"/>
+                <w:color w:val="1A1A1A"/>
+                <w:sz w:val="18"/>
+                <w:szCs w:val="18"/>
+              </w:rPr>
+              <w:t>~1.5 hs</w:t>
+            </w:r>
+          </w:p>
+        </w:tc>
+        <w:tc>
+          <w:tcPr>
+            <w:tcW w:w="2560" w:type="dxa"/>
+            <w:tcBorders>
+              <w:top w:val="single" w:sz="2" w:space="0" w:color="DDDDDD"/>
+              <w:start w:val="single" w:sz="2" w:space="0" w:color="DDDDDD"/>
+              <w:bottom w:val="single" w:sz="2" w:space="0" w:color="DDDDDD"/>
+              <w:end w:val="single" w:sz="2" w:space="0" w:color="DDDDDD"/>
+            </w:tcBorders>
+            <w:shd w:fill="F2F2F2" w:val="clear"/>
+          </w:tcPr>
+          <w:p>
+            <w:pPr>
+              <w:pStyle w:val="Normal"/>
+              <w:jc w:val="start"/>
+              <w:rPr/>
+            </w:pPr>
+            <w:r>
+              <w:rPr>
+                <w:rFonts w:eastAsia="Arial" w:cs="Arial"/>
+                <w:color w:val="1A1A1A"/>
+                <w:sz w:val="18"/>
+                <w:szCs w:val="18"/>
+              </w:rPr>
               <w:t xml:space="preserve">⬜ </w:t>
             </w:r>
             <w:r>
@@ -11046,7 +11170,131 @@
         <w:trPr/>
         <w:tc>
           <w:tcPr>
-            <w:tcW w:w="1199" w:type="dxa"/>
+            <w:tcW w:w="1198" w:type="dxa"/>
+            <w:tcBorders>
+              <w:top w:val="single" w:sz="2" w:space="0" w:color="DDDDDD"/>
+              <w:start w:val="single" w:sz="2" w:space="0" w:color="DDDDDD"/>
+              <w:bottom w:val="single" w:sz="2" w:space="0" w:color="DDDDDD"/>
+              <w:end w:val="single" w:sz="2" w:space="0" w:color="DDDDDD"/>
+            </w:tcBorders>
+            <w:shd w:fill="FFFFFF" w:val="clear"/>
+          </w:tcPr>
+          <w:p>
+            <w:pPr>
+              <w:pStyle w:val="Normal"/>
+              <w:jc w:val="center"/>
+              <w:rPr/>
+            </w:pPr>
+            <w:r>
+              <w:rPr>
+                <w:rFonts w:eastAsia="Arial" w:cs="Arial"/>
+                <w:color w:val="1A1A1A"/>
+                <w:sz w:val="18"/>
+                <w:szCs w:val="18"/>
+              </w:rPr>
+              <w:t>4</w:t>
+            </w:r>
+          </w:p>
+        </w:tc>
+        <w:tc>
+          <w:tcPr>
+            <w:tcW w:w="2802" w:type="dxa"/>
+            <w:tcBorders>
+              <w:top w:val="single" w:sz="2" w:space="0" w:color="DDDDDD"/>
+              <w:start w:val="single" w:sz="2" w:space="0" w:color="DDDDDD"/>
+              <w:bottom w:val="single" w:sz="2" w:space="0" w:color="DDDDDD"/>
+              <w:end w:val="single" w:sz="2" w:space="0" w:color="DDDDDD"/>
+            </w:tcBorders>
+            <w:shd w:fill="FFFFFF" w:val="clear"/>
+          </w:tcPr>
+          <w:p>
+            <w:pPr>
+              <w:pStyle w:val="Normal"/>
+              <w:jc w:val="start"/>
+              <w:rPr/>
+            </w:pPr>
+            <w:r>
+              <w:rPr>
+                <w:rFonts w:eastAsia="Arial" w:cs="Arial"/>
+                <w:color w:val="1A1A1A"/>
+                <w:sz w:val="18"/>
+                <w:szCs w:val="18"/>
+              </w:rPr>
+              <w:t>Etapa 4: Integración Groq API</w:t>
+            </w:r>
+          </w:p>
+        </w:tc>
+        <w:tc>
+          <w:tcPr>
+            <w:tcW w:w="1800" w:type="dxa"/>
+            <w:tcBorders>
+              <w:top w:val="single" w:sz="2" w:space="0" w:color="DDDDDD"/>
+              <w:start w:val="single" w:sz="2" w:space="0" w:color="DDDDDD"/>
+              <w:bottom w:val="single" w:sz="2" w:space="0" w:color="DDDDDD"/>
+              <w:end w:val="single" w:sz="2" w:space="0" w:color="DDDDDD"/>
+            </w:tcBorders>
+            <w:shd w:fill="FFFFFF" w:val="clear"/>
+          </w:tcPr>
+          <w:p>
+            <w:pPr>
+              <w:pStyle w:val="Normal"/>
+              <w:jc w:val="center"/>
+              <w:rPr/>
+            </w:pPr>
+            <w:r>
+              <w:rPr>
+                <w:rFonts w:eastAsia="Arial" w:cs="Arial"/>
+                <w:color w:val="1A1A1A"/>
+                <w:sz w:val="18"/>
+                <w:szCs w:val="18"/>
+              </w:rPr>
+              <w:t>~2 hs</w:t>
+            </w:r>
+          </w:p>
+        </w:tc>
+        <w:tc>
+          <w:tcPr>
+            <w:tcW w:w="2560" w:type="dxa"/>
+            <w:tcBorders>
+              <w:top w:val="single" w:sz="2" w:space="0" w:color="DDDDDD"/>
+              <w:start w:val="single" w:sz="2" w:space="0" w:color="DDDDDD"/>
+              <w:bottom w:val="single" w:sz="2" w:space="0" w:color="DDDDDD"/>
+              <w:end w:val="single" w:sz="2" w:space="0" w:color="DDDDDD"/>
+            </w:tcBorders>
+            <w:shd w:fill="FFFFFF" w:val="clear"/>
+          </w:tcPr>
+          <w:p>
+            <w:pPr>
+              <w:pStyle w:val="Normal"/>
+              <w:jc w:val="start"/>
+              <w:rPr/>
+            </w:pPr>
+            <w:r>
+              <w:rPr>
+                <w:rFonts w:eastAsia="Arial" w:cs="Arial"/>
+                <w:color w:val="1A1A1A"/>
+                <w:sz w:val="18"/>
+                <w:szCs w:val="18"/>
+              </w:rPr>
+              <w:t xml:space="preserve">⬜ </w:t>
+            </w:r>
+            <w:r>
+              <w:rPr>
+                <w:rFonts w:eastAsia="Arial" w:cs="Arial"/>
+                <w:color w:val="1A1A1A"/>
+                <w:sz w:val="18"/>
+                <w:szCs w:val="18"/>
+              </w:rPr>
+              <w:t>Pendiente</w:t>
+            </w:r>
+          </w:p>
+        </w:tc>
+      </w:tr>
+      <w:tr>
+        <w:trPr/>
+        <w:tc>
+          <w:tcPr>
+            <w:tcW w:w="1198" w:type="dxa"/>
             <w:tcBorders>
               <w:top w:val="single" w:sz="2" w:space="0" w:color="DDDDDD"/>
               <w:start w:val="single" w:sz="2" w:space="0" w:color="DDDDDD"/>
@@ -11068,13 +11316,13 @@
                 <w:sz w:val="18"/>
                 <w:szCs w:val="18"/>
               </w:rPr>
-              <w:t>3</w:t>
-            </w:r>
-          </w:p>
-        </w:tc>
-        <w:tc>
-          <w:tcPr>
-            <w:tcW w:w="2801" w:type="dxa"/>
+              <w:t>5</w:t>
+            </w:r>
+          </w:p>
+        </w:tc>
+        <w:tc>
+          <w:tcPr>
+            <w:tcW w:w="2802" w:type="dxa"/>
             <w:tcBorders>
               <w:top w:val="single" w:sz="2" w:space="0" w:color="DDDDDD"/>
               <w:start w:val="single" w:sz="2" w:space="0" w:color="DDDDDD"/>
@@ -11096,7 +11344,7 @@
                 <w:sz w:val="18"/>
                 <w:szCs w:val="18"/>
               </w:rPr>
-              <w:t>Etapa 3: Procesamiento Python/Pandas</w:t>
+              <w:t>Etapa 5: Backend Flask REST</w:t>
             </w:r>
           </w:p>
         </w:tc>
@@ -11170,7 +11418,7 @@
         <w:trPr/>
         <w:tc>
           <w:tcPr>
-            <w:tcW w:w="1199" w:type="dxa"/>
+            <w:tcW w:w="1198" w:type="dxa"/>
             <w:tcBorders>
               <w:top w:val="single" w:sz="2" w:space="0" w:color="DDDDDD"/>
               <w:start w:val="single" w:sz="2" w:space="0" w:color="DDDDDD"/>
@@ -11192,13 +11440,13 @@
                 <w:sz w:val="18"/>
                 <w:szCs w:val="18"/>
               </w:rPr>
-              <w:t>4</w:t>
-            </w:r>
-          </w:p>
-        </w:tc>
-        <w:tc>
-          <w:tcPr>
-            <w:tcW w:w="2801" w:type="dxa"/>
+              <w:t>6-7</w:t>
+            </w:r>
+          </w:p>
+        </w:tc>
+        <w:tc>
+          <w:tcPr>
+            <w:tcW w:w="2802" w:type="dxa"/>
             <w:tcBorders>
               <w:top w:val="single" w:sz="2" w:space="0" w:color="DDDDDD"/>
               <w:start w:val="single" w:sz="2" w:space="0" w:color="DDDDDD"/>
@@ -11220,7 +11468,7 @@
                 <w:sz w:val="18"/>
                 <w:szCs w:val="18"/>
               </w:rPr>
-              <w:t>Etapa 4: Integración Groq API</w:t>
+              <w:t>Etapa 6: Frontend React + Tailwind</w:t>
             </w:r>
           </w:p>
         </w:tc>
@@ -11248,7 +11496,7 @@
                 <w:sz w:val="18"/>
                 <w:szCs w:val="18"/>
               </w:rPr>
-              <w:t>~2 hs</w:t>
+              <w:t>~3 hs</w:t>
             </w:r>
           </w:p>
         </w:tc>
@@ -11294,7 +11542,7 @@
         <w:trPr/>
         <w:tc>
           <w:tcPr>
-            <w:tcW w:w="1199" w:type="dxa"/>
+            <w:tcW w:w="1198" w:type="dxa"/>
             <w:tcBorders>
               <w:top w:val="single" w:sz="2" w:space="0" w:color="DDDDDD"/>
               <w:start w:val="single" w:sz="2" w:space="0" w:color="DDDDDD"/>
@@ -11316,13 +11564,13 @@
                 <w:sz w:val="18"/>
                 <w:szCs w:val="18"/>
               </w:rPr>
-              <w:t>5</w:t>
-            </w:r>
-          </w:p>
-        </w:tc>
-        <w:tc>
-          <w:tcPr>
-            <w:tcW w:w="2801" w:type="dxa"/>
+              <w:t>8</w:t>
+            </w:r>
+          </w:p>
+        </w:tc>
+        <w:tc>
+          <w:tcPr>
+            <w:tcW w:w="2802" w:type="dxa"/>
             <w:tcBorders>
               <w:top w:val="single" w:sz="2" w:space="0" w:color="DDDDDD"/>
               <w:start w:val="single" w:sz="2" w:space="0" w:color="DDDDDD"/>
@@ -11344,7 +11592,7 @@
                 <w:sz w:val="18"/>
                 <w:szCs w:val="18"/>
               </w:rPr>
-              <w:t>Etapa 5: Backend Flask REST</w:t>
+              <w:t>Etapa 7: Documentación + GitHub</w:t>
             </w:r>
           </w:p>
         </w:tc>
@@ -11372,7 +11620,7 @@
                 <w:sz w:val="18"/>
                 <w:szCs w:val="18"/>
               </w:rPr>
-              <w:t>~1.5 hs</w:t>
+              <w:t>~1 hs</w:t>
             </w:r>
           </w:p>
         </w:tc>
@@ -11418,255 +11666,7 @@
         <w:trPr/>
         <w:tc>
           <w:tcPr>
-            <w:tcW w:w="1199" w:type="dxa"/>
-            <w:tcBorders>
-              <w:top w:val="single" w:sz="2" w:space="0" w:color="DDDDDD"/>
-              <w:start w:val="single" w:sz="2" w:space="0" w:color="DDDDDD"/>
-              <w:bottom w:val="single" w:sz="2" w:space="0" w:color="DDDDDD"/>
-              <w:end w:val="single" w:sz="2" w:space="0" w:color="DDDDDD"/>
-            </w:tcBorders>
-            <w:shd w:fill="FFFFFF" w:val="clear"/>
-          </w:tcPr>
-          <w:p>
-            <w:pPr>
-              <w:pStyle w:val="Normal"/>
-              <w:jc w:val="center"/>
-              <w:rPr/>
-            </w:pPr>
-            <w:r>
-              <w:rPr>
-                <w:rFonts w:eastAsia="Arial" w:cs="Arial"/>
-                <w:color w:val="1A1A1A"/>
-                <w:sz w:val="18"/>
-                <w:szCs w:val="18"/>
-              </w:rPr>
-              <w:t>6-7</w:t>
-            </w:r>
-          </w:p>
-        </w:tc>
-        <w:tc>
-          <w:tcPr>
-            <w:tcW w:w="2801" w:type="dxa"/>
-            <w:tcBorders>
-              <w:top w:val="single" w:sz="2" w:space="0" w:color="DDDDDD"/>
-              <w:start w:val="single" w:sz="2" w:space="0" w:color="DDDDDD"/>
-              <w:bottom w:val="single" w:sz="2" w:space="0" w:color="DDDDDD"/>
-              <w:end w:val="single" w:sz="2" w:space="0" w:color="DDDDDD"/>
-            </w:tcBorders>
-            <w:shd w:fill="FFFFFF" w:val="clear"/>
-          </w:tcPr>
-          <w:p>
-            <w:pPr>
-              <w:pStyle w:val="Normal"/>
-              <w:jc w:val="start"/>
-              <w:rPr/>
-            </w:pPr>
-            <w:r>
-              <w:rPr>
-                <w:rFonts w:eastAsia="Arial" w:cs="Arial"/>
-                <w:color w:val="1A1A1A"/>
-                <w:sz w:val="18"/>
-                <w:szCs w:val="18"/>
-              </w:rPr>
-              <w:t>Etapa 6: Frontend React + Tailwind</w:t>
-            </w:r>
-          </w:p>
-        </w:tc>
-        <w:tc>
-          <w:tcPr>
-            <w:tcW w:w="1800" w:type="dxa"/>
-            <w:tcBorders>
-              <w:top w:val="single" w:sz="2" w:space="0" w:color="DDDDDD"/>
-              <w:start w:val="single" w:sz="2" w:space="0" w:color="DDDDDD"/>
-              <w:bottom w:val="single" w:sz="2" w:space="0" w:color="DDDDDD"/>
-              <w:end w:val="single" w:sz="2" w:space="0" w:color="DDDDDD"/>
-            </w:tcBorders>
-            <w:shd w:fill="FFFFFF" w:val="clear"/>
-          </w:tcPr>
-          <w:p>
-            <w:pPr>
-              <w:pStyle w:val="Normal"/>
-              <w:jc w:val="center"/>
-              <w:rPr/>
-            </w:pPr>
-            <w:r>
-              <w:rPr>
-                <w:rFonts w:eastAsia="Arial" w:cs="Arial"/>
-                <w:color w:val="1A1A1A"/>
-                <w:sz w:val="18"/>
-                <w:szCs w:val="18"/>
-              </w:rPr>
-              <w:t>~3 hs</w:t>
-            </w:r>
-          </w:p>
-        </w:tc>
-        <w:tc>
-          <w:tcPr>
-            <w:tcW w:w="2560" w:type="dxa"/>
-            <w:tcBorders>
-              <w:top w:val="single" w:sz="2" w:space="0" w:color="DDDDDD"/>
-              <w:start w:val="single" w:sz="2" w:space="0" w:color="DDDDDD"/>
-              <w:bottom w:val="single" w:sz="2" w:space="0" w:color="DDDDDD"/>
-              <w:end w:val="single" w:sz="2" w:space="0" w:color="DDDDDD"/>
-            </w:tcBorders>
-            <w:shd w:fill="FFFFFF" w:val="clear"/>
-          </w:tcPr>
-          <w:p>
-            <w:pPr>
-              <w:pStyle w:val="Normal"/>
-              <w:jc w:val="start"/>
-              <w:rPr/>
-            </w:pPr>
-            <w:r>
-              <w:rPr>
-                <w:rFonts w:eastAsia="Arial" w:cs="Arial"/>
-                <w:color w:val="1A1A1A"/>
-                <w:sz w:val="18"/>
-                <w:szCs w:val="18"/>
-              </w:rPr>
-              <w:t xml:space="preserve">⬜ </w:t>
-            </w:r>
-            <w:r>
-              <w:rPr>
-                <w:rFonts w:eastAsia="Arial" w:cs="Arial"/>
-                <w:color w:val="1A1A1A"/>
-                <w:sz w:val="18"/>
-                <w:szCs w:val="18"/>
-              </w:rPr>
-              <w:t>Pendiente</w:t>
-            </w:r>
-          </w:p>
-        </w:tc>
-      </w:tr>
-      <w:tr>
-        <w:trPr/>
-        <w:tc>
-          <w:tcPr>
-            <w:tcW w:w="1199" w:type="dxa"/>
-            <w:tcBorders>
-              <w:top w:val="single" w:sz="2" w:space="0" w:color="DDDDDD"/>
-              <w:start w:val="single" w:sz="2" w:space="0" w:color="DDDDDD"/>
-              <w:bottom w:val="single" w:sz="2" w:space="0" w:color="DDDDDD"/>
-              <w:end w:val="single" w:sz="2" w:space="0" w:color="DDDDDD"/>
-            </w:tcBorders>
-            <w:shd w:fill="F2F2F2" w:val="clear"/>
-          </w:tcPr>
-          <w:p>
-            <w:pPr>
-              <w:pStyle w:val="Normal"/>
-              <w:jc w:val="center"/>
-              <w:rPr/>
-            </w:pPr>
-            <w:r>
-              <w:rPr>
-                <w:rFonts w:eastAsia="Arial" w:cs="Arial"/>
-                <w:color w:val="1A1A1A"/>
-                <w:sz w:val="18"/>
-                <w:szCs w:val="18"/>
-              </w:rPr>
-              <w:t>8</w:t>
-            </w:r>
-          </w:p>
-        </w:tc>
-        <w:tc>
-          <w:tcPr>
-            <w:tcW w:w="2801" w:type="dxa"/>
-            <w:tcBorders>
-              <w:top w:val="single" w:sz="2" w:space="0" w:color="DDDDDD"/>
-              <w:start w:val="single" w:sz="2" w:space="0" w:color="DDDDDD"/>
-              <w:bottom w:val="single" w:sz="2" w:space="0" w:color="DDDDDD"/>
-              <w:end w:val="single" w:sz="2" w:space="0" w:color="DDDDDD"/>
-            </w:tcBorders>
-            <w:shd w:fill="F2F2F2" w:val="clear"/>
-          </w:tcPr>
-          <w:p>
-            <w:pPr>
-              <w:pStyle w:val="Normal"/>
-              <w:jc w:val="start"/>
-              <w:rPr/>
-            </w:pPr>
-            <w:r>
-              <w:rPr>
-                <w:rFonts w:eastAsia="Arial" w:cs="Arial"/>
-                <w:color w:val="1A1A1A"/>
-                <w:sz w:val="18"/>
-                <w:szCs w:val="18"/>
-              </w:rPr>
-              <w:t>Etapa 7: Documentación + GitHub</w:t>
-            </w:r>
-          </w:p>
-        </w:tc>
-        <w:tc>
-          <w:tcPr>
-            <w:tcW w:w="1800" w:type="dxa"/>
-            <w:tcBorders>
-              <w:top w:val="single" w:sz="2" w:space="0" w:color="DDDDDD"/>
-              <w:start w:val="single" w:sz="2" w:space="0" w:color="DDDDDD"/>
-              <w:bottom w:val="single" w:sz="2" w:space="0" w:color="DDDDDD"/>
-              <w:end w:val="single" w:sz="2" w:space="0" w:color="DDDDDD"/>
-            </w:tcBorders>
-            <w:shd w:fill="F2F2F2" w:val="clear"/>
-          </w:tcPr>
-          <w:p>
-            <w:pPr>
-              <w:pStyle w:val="Normal"/>
-              <w:jc w:val="center"/>
-              <w:rPr/>
-            </w:pPr>
-            <w:r>
-              <w:rPr>
-                <w:rFonts w:eastAsia="Arial" w:cs="Arial"/>
-                <w:color w:val="1A1A1A"/>
-                <w:sz w:val="18"/>
-                <w:szCs w:val="18"/>
-              </w:rPr>
-              <w:t>~1 hs</w:t>
-            </w:r>
-          </w:p>
-        </w:tc>
-        <w:tc>
-          <w:tcPr>
-            <w:tcW w:w="2560" w:type="dxa"/>
-            <w:tcBorders>
-              <w:top w:val="single" w:sz="2" w:space="0" w:color="DDDDDD"/>
-              <w:start w:val="single" w:sz="2" w:space="0" w:color="DDDDDD"/>
-              <w:bottom w:val="single" w:sz="2" w:space="0" w:color="DDDDDD"/>
-              <w:end w:val="single" w:sz="2" w:space="0" w:color="DDDDDD"/>
-            </w:tcBorders>
-            <w:shd w:fill="F2F2F2" w:val="clear"/>
-          </w:tcPr>
-          <w:p>
-            <w:pPr>
-              <w:pStyle w:val="Normal"/>
-              <w:jc w:val="start"/>
-              <w:rPr/>
-            </w:pPr>
-            <w:r>
-              <w:rPr>
-                <w:rFonts w:eastAsia="Arial" w:cs="Arial"/>
-                <w:color w:val="1A1A1A"/>
-                <w:sz w:val="18"/>
-                <w:szCs w:val="18"/>
-              </w:rPr>
-              <w:t xml:space="preserve">⬜ </w:t>
-            </w:r>
-            <w:r>
-              <w:rPr>
-                <w:rFonts w:eastAsia="Arial" w:cs="Arial"/>
-                <w:color w:val="1A1A1A"/>
-                <w:sz w:val="18"/>
-                <w:szCs w:val="18"/>
-              </w:rPr>
-              <w:t>Pendiente</w:t>
-            </w:r>
-          </w:p>
-        </w:tc>
-      </w:tr>
-      <w:tr>
-        <w:trPr/>
-        <w:tc>
-          <w:tcPr>
-            <w:tcW w:w="1199" w:type="dxa"/>
+            <w:tcW w:w="1198" w:type="dxa"/>
             <w:tcBorders>
               <w:top w:val="single" w:sz="2" w:space="0" w:color="DDDDDD"/>
               <w:start w:val="single" w:sz="2" w:space="0" w:color="DDDDDD"/>
@@ -11695,7 +11695,7 @@
         </w:tc>
         <w:tc>
           <w:tcPr>
-            <w:tcW w:w="2801" w:type="dxa"/>
+            <w:tcW w:w="2802" w:type="dxa"/>
             <w:tcBorders>
               <w:top w:val="single" w:sz="2" w:space="0" w:color="DDDDDD"/>
               <w:start w:val="single" w:sz="2" w:space="0" w:color="DDDDDD"/>
@@ -12613,7 +12613,7 @@
         <w:pStyle w:val="ListParagraph"/>
         <w:numPr>
           <w:ilvl w:val="0"/>
-          <w:numId w:val="1"/>
+          <w:numId w:val="2"/>
         </w:numPr>
         <w:spacing w:before="0" w:after="60"/>
         <w:rPr/>
@@ -12633,7 +12633,7 @@
         <w:pStyle w:val="ListParagraph"/>
         <w:numPr>
           <w:ilvl w:val="0"/>
-          <w:numId w:val="1"/>
+          <w:numId w:val="2"/>
         </w:numPr>
         <w:spacing w:before="0" w:after="60"/>
         <w:rPr/>
@@ -12653,7 +12653,7 @@
         <w:pStyle w:val="ListParagraph"/>
         <w:numPr>
           <w:ilvl w:val="0"/>
-          <w:numId w:val="1"/>
+          <w:numId w:val="2"/>
         </w:numPr>
         <w:spacing w:before="0" w:after="60"/>
         <w:rPr/>
@@ -12673,7 +12673,7 @@
         <w:pStyle w:val="ListParagraph"/>
         <w:numPr>
           <w:ilvl w:val="0"/>
-          <w:numId w:val="1"/>
+          <w:numId w:val="2"/>
         </w:numPr>
         <w:spacing w:before="0" w:after="60"/>
         <w:rPr/>
@@ -12693,7 +12693,7 @@
         <w:pStyle w:val="ListParagraph"/>
         <w:numPr>
           <w:ilvl w:val="0"/>
-          <w:numId w:val="1"/>
+          <w:numId w:val="2"/>
         </w:numPr>
         <w:spacing w:before="0" w:after="60"/>
         <w:rPr/>
@@ -12801,6 +12801,7 @@
         </w:tabs>
         <w:ind w:start="1440" w:hanging="360"/>
       </w:pPr>
+      <w:rPr/>
     </w:lvl>
     <w:lvl w:ilvl="3">
       <w:start w:val="1"/>
@@ -12813,6 +12814,7 @@
         </w:tabs>
         <w:ind w:start="1800" w:hanging="360"/>
       </w:pPr>
+      <w:rPr/>
     </w:lvl>
     <w:lvl w:ilvl="4">
       <w:start w:val="1"/>
@@ -12825,6 +12827,7 @@
         </w:tabs>
         <w:ind w:start="2160" w:hanging="360"/>
       </w:pPr>
+      <w:rPr/>
     </w:lvl>
     <w:lvl w:ilvl="5">
       <w:start w:val="1"/>
@@ -12837,6 +12840,7 @@
         </w:tabs>
         <w:ind w:start="2520" w:hanging="360"/>
       </w:pPr>
+      <w:rPr/>
     </w:lvl>
     <w:lvl w:ilvl="6">
       <w:start w:val="1"/>
@@ -12849,6 +12853,7 @@
         </w:tabs>
         <w:ind w:start="2880" w:hanging="360"/>
       </w:pPr>
+      <w:rPr/>
     </w:lvl>
     <w:lvl w:ilvl="7">
       <w:start w:val="1"/>
@@ -12861,6 +12866,7 @@
         </w:tabs>
         <w:ind w:start="3240" w:hanging="360"/>
       </w:pPr>
+      <w:rPr/>
     </w:lvl>
     <w:lvl w:ilvl="8">
       <w:start w:val="1"/>
@@ -12873,9 +12879,133 @@
         </w:tabs>
         <w:ind w:start="3600" w:hanging="360"/>
       </w:pPr>
+      <w:rPr/>
     </w:lvl>
   </w:abstractNum>
   <w:abstractNum w:abstractNumId="2">
+    <w:lvl w:ilvl="0">
+      <w:start w:val="1"/>
+      <w:numFmt w:val="bullet"/>
+      <w:lvlText w:val=""/>
+      <w:lvlJc w:val="start"/>
+      <w:pPr>
+        <w:tabs>
+          <w:tab w:val="num" w:pos="0"/>
+        </w:tabs>
+        <w:ind w:start="720" w:hanging="360"/>
+      </w:pPr>
+      <w:rPr>
+        <w:rFonts w:ascii="Symbol" w:hAnsi="Symbol" w:cs="Symbol" w:hint="default"/>
+      </w:rPr>
+    </w:lvl>
+    <w:lvl w:ilvl="1">
+      <w:start w:val="1"/>
+      <w:numFmt w:val="bullet"/>
+      <w:lvlText w:val="◦"/>
+      <w:lvlJc w:val="start"/>
+      <w:pPr>
+        <w:tabs>
+          <w:tab w:val="num" w:pos="0"/>
+        </w:tabs>
+        <w:ind w:start="1080" w:hanging="360"/>
+      </w:pPr>
+      <w:rPr>
+        <w:rFonts w:ascii="OpenSymbol" w:hAnsi="OpenSymbol" w:cs="OpenSymbol" w:hint="default"/>
+      </w:rPr>
+    </w:lvl>
+    <w:lvl w:ilvl="2">
+      <w:start w:val="1"/>
+      <w:numFmt w:val="decimal"/>
+      <w:lvlText w:val="%3."/>
+      <w:lvlJc w:val="start"/>
+      <w:pPr>
+        <w:tabs>
+          <w:tab w:val="num" w:pos="1440"/>
+        </w:tabs>
+        <w:ind w:start="1440" w:hanging="360"/>
+      </w:pPr>
+      <w:rPr/>
+    </w:lvl>
+    <w:lvl w:ilvl="3">
+      <w:start w:val="1"/>
+      <w:numFmt w:val="decimal"/>
+      <w:lvlText w:val="%4."/>
+      <w:lvlJc w:val="start"/>
+      <w:pPr>
+        <w:tabs>
+          <w:tab w:val="num" w:pos="1800"/>
+        </w:tabs>
+        <w:ind w:start="1800" w:hanging="360"/>
+      </w:pPr>
+      <w:rPr/>
+    </w:lvl>
+    <w:lvl w:ilvl="4">
+      <w:start w:val="1"/>
+      <w:numFmt w:val="decimal"/>
+      <w:lvlText w:val="%5."/>
+      <w:lvlJc w:val="start"/>
+      <w:pPr>
+        <w:tabs>
+          <w:tab w:val="num" w:pos="2160"/>
+        </w:tabs>
+        <w:ind w:start="2160" w:hanging="360"/>
+      </w:pPr>
+      <w:rPr/>
+    </w:lvl>
+    <w:lvl w:ilvl="5">
+      <w:start w:val="1"/>
+      <w:numFmt w:val="decimal"/>
+      <w:lvlText w:val="%6."/>
+      <w:lvlJc w:val="start"/>
+      <w:pPr>
+        <w:tabs>
+          <w:tab w:val="num" w:pos="2520"/>
+        </w:tabs>
+        <w:ind w:start="2520" w:hanging="360"/>
+      </w:pPr>
+      <w:rPr/>
+    </w:lvl>
+    <w:lvl w:ilvl="6">
+      <w:start w:val="1"/>
+      <w:numFmt w:val="decimal"/>
+      <w:lvlText w:val="%7."/>
+      <w:lvlJc w:val="start"/>
+      <w:pPr>
+        <w:tabs>
+          <w:tab w:val="num" w:pos="2880"/>
+        </w:tabs>
+        <w:ind w:start="2880" w:hanging="360"/>
+      </w:pPr>
+      <w:rPr/>
+    </w:lvl>
+    <w:lvl w:ilvl="7">
+      <w:start w:val="1"/>
+      <w:numFmt w:val="decimal"/>
+      <w:lvlText w:val="%8."/>
+      <w:lvlJc w:val="start"/>
+      <w:pPr>
+        <w:tabs>
+          <w:tab w:val="num" w:pos="3240"/>
+        </w:tabs>
+        <w:ind w:start="3240" w:hanging="360"/>
+      </w:pPr>
+      <w:rPr/>
+    </w:lvl>
+    <w:lvl w:ilvl="8">
+      <w:start w:val="1"/>
+      <w:numFmt w:val="decimal"/>
+      <w:lvlText w:val="%9."/>
+      <w:lvlJc w:val="start"/>
+      <w:pPr>
+        <w:tabs>
+          <w:tab w:val="num" w:pos="3600"/>
+        </w:tabs>
+        <w:ind w:start="3600" w:hanging="360"/>
+      </w:pPr>
+      <w:rPr/>
+    </w:lvl>
+  </w:abstractNum>
+  <w:abstractNum w:abstractNumId="3">
     <w:lvl w:ilvl="0">
       <w:start w:val="1"/>
       <w:numFmt w:val="none"/>
@@ -13001,7 +13131,10 @@
     <w:abstractNumId w:val="2"/>
   </w:num>
   <w:num w:numId="3">
-    <w:abstractNumId w:val="1"/>
+    <w:abstractNumId w:val="3"/>
+  </w:num>
+  <w:num w:numId="4">
+    <w:abstractNumId w:val="2"/>
     <w:lvlOverride w:ilvl="0">
       <w:startOverride w:val="1"/>
     </w:lvlOverride>
@@ -13029,6 +13162,7 @@
     <w:qFormat/>
     <w:pPr>
       <w:widowControl/>
+      <w:suppressAutoHyphens w:val="true"/>
       <w:bidi w:val="0"/>
       <w:spacing w:before="0" w:after="0"/>
       <w:jc w:val="start"/>
@@ -13131,11 +13265,18 @@
       <w:u w:val="single"/>
     </w:rPr>
   </w:style>
-  <w:style w:type="character" w:styleId="FootnoteCharacters">
-    <w:name w:val="Footnote Characters"/>
+  <w:style w:type="character" w:styleId="FootnoteCharactersuser">
+    <w:name w:val="Footnote Characters (user)"/>
     <w:uiPriority w:val="99"/>
     <w:semiHidden/>
     <w:unhideWhenUsed/>
+    <w:qFormat/>
+    <w:rPr>
+      <w:vertAlign w:val="superscript"/>
+    </w:rPr>
+  </w:style>
+  <w:style w:type="character" w:styleId="FootnoteCharacters">
+    <w:name w:val="Footnote Characters"/>
     <w:qFormat/>
     <w:rPr>
       <w:vertAlign w:val="superscript"/>
@@ -13159,11 +13300,18 @@
       <w:szCs w:val="20"/>
     </w:rPr>
   </w:style>
-  <w:style w:type="character" w:styleId="EndnoteCharacters">
-    <w:name w:val="Endnote Characters"/>
+  <w:style w:type="character" w:styleId="EndnoteCharactersuser">
+    <w:name w:val="Endnote Characters (user)"/>
     <w:uiPriority w:val="99"/>
     <w:semiHidden/>
     <w:unhideWhenUsed/>
+    <w:qFormat/>
+    <w:rPr>
+      <w:vertAlign w:val="superscript"/>
+    </w:rPr>
+  </w:style>
+  <w:style w:type="character" w:styleId="EndnoteCharacters">
+    <w:name w:val="Endnote Characters"/>
     <w:qFormat/>
     <w:rPr>
       <w:vertAlign w:val="superscript"/>
@@ -13260,6 +13408,7 @@
     <w:qFormat/>
     <w:pPr>
       <w:widowControl/>
+      <w:suppressAutoHyphens w:val="true"/>
       <w:bidi w:val="0"/>
       <w:spacing w:before="0" w:after="0"/>
       <w:jc w:val="start"/>
@@ -13280,6 +13429,7 @@
     <w:qFormat/>
     <w:pPr>
       <w:widowControl/>
+      <w:suppressAutoHyphens w:val="true"/>
       <w:bidi w:val="0"/>
       <w:spacing w:before="0" w:after="0"/>
       <w:jc w:val="start"/>

</xml_diff>

<commit_message>
feat: Etapa 3 — análisis de cartera con Pandas + test suite
Agrega backend/app/analysis.py con 4 funciones (calcular_indice_concentracion,
calcular_tendencia_mora, formatear_montos_ars, construir_payload_kpis) y
backend/tests/test_analysis.py con 29 tests passing. construir_payload_kpis
es el punto de entrada único que Flask consumirá en Etapa 5.

Co-Authored-By: Claude Sonnet 4.6 <noreply@anthropic.com>
</commit_message>
<xml_diff>
--- a/docs/credit_portfolio_analyzer_plan.docx
+++ b/docs/credit_portfolio_analyzer_plan.docx
@@ -10666,8 +10666,8 @@
         </w:tblCellMar>
       </w:tblPr>
       <w:tblGrid>
-        <w:gridCol w:w="1198"/>
-        <w:gridCol w:w="2802"/>
+        <w:gridCol w:w="1197"/>
+        <w:gridCol w:w="2803"/>
         <w:gridCol w:w="1800"/>
         <w:gridCol w:w="2560"/>
       </w:tblGrid>
@@ -10675,7 +10675,7 @@
         <w:trPr/>
         <w:tc>
           <w:tcPr>
-            <w:tcW w:w="1198" w:type="dxa"/>
+            <w:tcW w:w="1197" w:type="dxa"/>
             <w:tcBorders>
               <w:top w:val="single" w:sz="2" w:space="0" w:color="2E75B6"/>
               <w:start w:val="single" w:sz="2" w:space="0" w:color="2E75B6"/>
@@ -10705,7 +10705,7 @@
         </w:tc>
         <w:tc>
           <w:tcPr>
-            <w:tcW w:w="2802" w:type="dxa"/>
+            <w:tcW w:w="2803" w:type="dxa"/>
             <w:tcBorders>
               <w:top w:val="single" w:sz="2" w:space="0" w:color="2E75B6"/>
               <w:start w:val="single" w:sz="2" w:space="0" w:color="2E75B6"/>
@@ -10798,7 +10798,7 @@
         <w:trPr/>
         <w:tc>
           <w:tcPr>
-            <w:tcW w:w="1198" w:type="dxa"/>
+            <w:tcW w:w="1197" w:type="dxa"/>
             <w:tcBorders>
               <w:top w:val="single" w:sz="2" w:space="0" w:color="DDDDDD"/>
               <w:start w:val="single" w:sz="2" w:space="0" w:color="DDDDDD"/>
@@ -10826,7 +10826,7 @@
         </w:tc>
         <w:tc>
           <w:tcPr>
-            <w:tcW w:w="2802" w:type="dxa"/>
+            <w:tcW w:w="2803" w:type="dxa"/>
             <w:tcBorders>
               <w:top w:val="single" w:sz="2" w:space="0" w:color="DDDDDD"/>
               <w:start w:val="single" w:sz="2" w:space="0" w:color="DDDDDD"/>
@@ -10922,7 +10922,7 @@
         <w:trPr/>
         <w:tc>
           <w:tcPr>
-            <w:tcW w:w="1198" w:type="dxa"/>
+            <w:tcW w:w="1197" w:type="dxa"/>
             <w:tcBorders>
               <w:top w:val="single" w:sz="2" w:space="0" w:color="DDDDDD"/>
               <w:start w:val="single" w:sz="2" w:space="0" w:color="DDDDDD"/>
@@ -10950,7 +10950,7 @@
         </w:tc>
         <w:tc>
           <w:tcPr>
-            <w:tcW w:w="2802" w:type="dxa"/>
+            <w:tcW w:w="2803" w:type="dxa"/>
             <w:tcBorders>
               <w:top w:val="single" w:sz="2" w:space="0" w:color="DDDDDD"/>
               <w:start w:val="single" w:sz="2" w:space="0" w:color="DDDDDD"/>
@@ -11046,7 +11046,7 @@
         <w:trPr/>
         <w:tc>
           <w:tcPr>
-            <w:tcW w:w="1198" w:type="dxa"/>
+            <w:tcW w:w="1197" w:type="dxa"/>
             <w:tcBorders>
               <w:top w:val="single" w:sz="2" w:space="0" w:color="DDDDDD"/>
               <w:start w:val="single" w:sz="2" w:space="0" w:color="DDDDDD"/>
@@ -11074,7 +11074,7 @@
         </w:tc>
         <w:tc>
           <w:tcPr>
-            <w:tcW w:w="2802" w:type="dxa"/>
+            <w:tcW w:w="2803" w:type="dxa"/>
             <w:tcBorders>
               <w:top w:val="single" w:sz="2" w:space="0" w:color="DDDDDD"/>
               <w:start w:val="single" w:sz="2" w:space="0" w:color="DDDDDD"/>
@@ -11141,6 +11141,74 @@
           </w:tcPr>
           <w:p>
             <w:pPr>
+              <w:pStyle w:val="ListParagraph"/>
+              <w:spacing w:before="0" w:after="60"/>
+              <w:rPr/>
+            </w:pPr>
+            <w:r>
+              <w:rPr>
+                <w:rFonts w:eastAsia="Arial" w:cs="Arial"/>
+                <w:color w:val="1A1A1A"/>
+                <w:sz w:val="20"/>
+                <w:szCs w:val="20"/>
+              </w:rPr>
+              <w:t xml:space="preserve">✅ </w:t>
+            </w:r>
+            <w:r>
+              <w:rPr>
+                <w:rFonts w:eastAsia="Arial" w:cs="Arial"/>
+                <w:color w:val="1A1A1A"/>
+                <w:sz w:val="20"/>
+                <w:szCs w:val="20"/>
+              </w:rPr>
+              <w:t>Completo</w:t>
+            </w:r>
+          </w:p>
+        </w:tc>
+      </w:tr>
+      <w:tr>
+        <w:trPr/>
+        <w:tc>
+          <w:tcPr>
+            <w:tcW w:w="1197" w:type="dxa"/>
+            <w:tcBorders>
+              <w:top w:val="single" w:sz="2" w:space="0" w:color="DDDDDD"/>
+              <w:start w:val="single" w:sz="2" w:space="0" w:color="DDDDDD"/>
+              <w:bottom w:val="single" w:sz="2" w:space="0" w:color="DDDDDD"/>
+              <w:end w:val="single" w:sz="2" w:space="0" w:color="DDDDDD"/>
+            </w:tcBorders>
+            <w:shd w:fill="FFFFFF" w:val="clear"/>
+          </w:tcPr>
+          <w:p>
+            <w:pPr>
+              <w:pStyle w:val="Normal"/>
+              <w:jc w:val="center"/>
+              <w:rPr/>
+            </w:pPr>
+            <w:r>
+              <w:rPr>
+                <w:rFonts w:eastAsia="Arial" w:cs="Arial"/>
+                <w:color w:val="1A1A1A"/>
+                <w:sz w:val="18"/>
+                <w:szCs w:val="18"/>
+              </w:rPr>
+              <w:t>4</w:t>
+            </w:r>
+          </w:p>
+        </w:tc>
+        <w:tc>
+          <w:tcPr>
+            <w:tcW w:w="2803" w:type="dxa"/>
+            <w:tcBorders>
+              <w:top w:val="single" w:sz="2" w:space="0" w:color="DDDDDD"/>
+              <w:start w:val="single" w:sz="2" w:space="0" w:color="DDDDDD"/>
+              <w:bottom w:val="single" w:sz="2" w:space="0" w:color="DDDDDD"/>
+              <w:end w:val="single" w:sz="2" w:space="0" w:color="DDDDDD"/>
+            </w:tcBorders>
+            <w:shd w:fill="FFFFFF" w:val="clear"/>
+          </w:tcPr>
+          <w:p>
+            <w:pPr>
               <w:pStyle w:val="Normal"/>
               <w:jc w:val="start"/>
               <w:rPr/>
@@ -11152,6 +11220,62 @@
                 <w:sz w:val="18"/>
                 <w:szCs w:val="18"/>
               </w:rPr>
+              <w:t>Etapa 4: Integración Groq API</w:t>
+            </w:r>
+          </w:p>
+        </w:tc>
+        <w:tc>
+          <w:tcPr>
+            <w:tcW w:w="1800" w:type="dxa"/>
+            <w:tcBorders>
+              <w:top w:val="single" w:sz="2" w:space="0" w:color="DDDDDD"/>
+              <w:start w:val="single" w:sz="2" w:space="0" w:color="DDDDDD"/>
+              <w:bottom w:val="single" w:sz="2" w:space="0" w:color="DDDDDD"/>
+              <w:end w:val="single" w:sz="2" w:space="0" w:color="DDDDDD"/>
+            </w:tcBorders>
+            <w:shd w:fill="FFFFFF" w:val="clear"/>
+          </w:tcPr>
+          <w:p>
+            <w:pPr>
+              <w:pStyle w:val="Normal"/>
+              <w:jc w:val="center"/>
+              <w:rPr/>
+            </w:pPr>
+            <w:r>
+              <w:rPr>
+                <w:rFonts w:eastAsia="Arial" w:cs="Arial"/>
+                <w:color w:val="1A1A1A"/>
+                <w:sz w:val="18"/>
+                <w:szCs w:val="18"/>
+              </w:rPr>
+              <w:t>~2 hs</w:t>
+            </w:r>
+          </w:p>
+        </w:tc>
+        <w:tc>
+          <w:tcPr>
+            <w:tcW w:w="2560" w:type="dxa"/>
+            <w:tcBorders>
+              <w:top w:val="single" w:sz="2" w:space="0" w:color="DDDDDD"/>
+              <w:start w:val="single" w:sz="2" w:space="0" w:color="DDDDDD"/>
+              <w:bottom w:val="single" w:sz="2" w:space="0" w:color="DDDDDD"/>
+              <w:end w:val="single" w:sz="2" w:space="0" w:color="DDDDDD"/>
+            </w:tcBorders>
+            <w:shd w:fill="FFFFFF" w:val="clear"/>
+          </w:tcPr>
+          <w:p>
+            <w:pPr>
+              <w:pStyle w:val="Normal"/>
+              <w:jc w:val="start"/>
+              <w:rPr/>
+            </w:pPr>
+            <w:r>
+              <w:rPr>
+                <w:rFonts w:eastAsia="Arial" w:cs="Arial"/>
+                <w:color w:val="1A1A1A"/>
+                <w:sz w:val="18"/>
+                <w:szCs w:val="18"/>
+              </w:rPr>
               <w:t xml:space="preserve">⬜ </w:t>
             </w:r>
             <w:r>
@@ -11170,7 +11294,131 @@
         <w:trPr/>
         <w:tc>
           <w:tcPr>
-            <w:tcW w:w="1198" w:type="dxa"/>
+            <w:tcW w:w="1197" w:type="dxa"/>
+            <w:tcBorders>
+              <w:top w:val="single" w:sz="2" w:space="0" w:color="DDDDDD"/>
+              <w:start w:val="single" w:sz="2" w:space="0" w:color="DDDDDD"/>
+              <w:bottom w:val="single" w:sz="2" w:space="0" w:color="DDDDDD"/>
+              <w:end w:val="single" w:sz="2" w:space="0" w:color="DDDDDD"/>
+            </w:tcBorders>
+            <w:shd w:fill="F2F2F2" w:val="clear"/>
+          </w:tcPr>
+          <w:p>
+            <w:pPr>
+              <w:pStyle w:val="Normal"/>
+              <w:jc w:val="center"/>
+              <w:rPr/>
+            </w:pPr>
+            <w:r>
+              <w:rPr>
+                <w:rFonts w:eastAsia="Arial" w:cs="Arial"/>
+                <w:color w:val="1A1A1A"/>
+                <w:sz w:val="18"/>
+                <w:szCs w:val="18"/>
+              </w:rPr>
+              <w:t>5</w:t>
+            </w:r>
+          </w:p>
+        </w:tc>
+        <w:tc>
+          <w:tcPr>
+            <w:tcW w:w="2803" w:type="dxa"/>
+            <w:tcBorders>
+              <w:top w:val="single" w:sz="2" w:space="0" w:color="DDDDDD"/>
+              <w:start w:val="single" w:sz="2" w:space="0" w:color="DDDDDD"/>
+              <w:bottom w:val="single" w:sz="2" w:space="0" w:color="DDDDDD"/>
+              <w:end w:val="single" w:sz="2" w:space="0" w:color="DDDDDD"/>
+            </w:tcBorders>
+            <w:shd w:fill="F2F2F2" w:val="clear"/>
+          </w:tcPr>
+          <w:p>
+            <w:pPr>
+              <w:pStyle w:val="Normal"/>
+              <w:jc w:val="start"/>
+              <w:rPr/>
+            </w:pPr>
+            <w:r>
+              <w:rPr>
+                <w:rFonts w:eastAsia="Arial" w:cs="Arial"/>
+                <w:color w:val="1A1A1A"/>
+                <w:sz w:val="18"/>
+                <w:szCs w:val="18"/>
+              </w:rPr>
+              <w:t>Etapa 5: Backend Flask REST</w:t>
+            </w:r>
+          </w:p>
+        </w:tc>
+        <w:tc>
+          <w:tcPr>
+            <w:tcW w:w="1800" w:type="dxa"/>
+            <w:tcBorders>
+              <w:top w:val="single" w:sz="2" w:space="0" w:color="DDDDDD"/>
+              <w:start w:val="single" w:sz="2" w:space="0" w:color="DDDDDD"/>
+              <w:bottom w:val="single" w:sz="2" w:space="0" w:color="DDDDDD"/>
+              <w:end w:val="single" w:sz="2" w:space="0" w:color="DDDDDD"/>
+            </w:tcBorders>
+            <w:shd w:fill="F2F2F2" w:val="clear"/>
+          </w:tcPr>
+          <w:p>
+            <w:pPr>
+              <w:pStyle w:val="Normal"/>
+              <w:jc w:val="center"/>
+              <w:rPr/>
+            </w:pPr>
+            <w:r>
+              <w:rPr>
+                <w:rFonts w:eastAsia="Arial" w:cs="Arial"/>
+                <w:color w:val="1A1A1A"/>
+                <w:sz w:val="18"/>
+                <w:szCs w:val="18"/>
+              </w:rPr>
+              <w:t>~1.5 hs</w:t>
+            </w:r>
+          </w:p>
+        </w:tc>
+        <w:tc>
+          <w:tcPr>
+            <w:tcW w:w="2560" w:type="dxa"/>
+            <w:tcBorders>
+              <w:top w:val="single" w:sz="2" w:space="0" w:color="DDDDDD"/>
+              <w:start w:val="single" w:sz="2" w:space="0" w:color="DDDDDD"/>
+              <w:bottom w:val="single" w:sz="2" w:space="0" w:color="DDDDDD"/>
+              <w:end w:val="single" w:sz="2" w:space="0" w:color="DDDDDD"/>
+            </w:tcBorders>
+            <w:shd w:fill="F2F2F2" w:val="clear"/>
+          </w:tcPr>
+          <w:p>
+            <w:pPr>
+              <w:pStyle w:val="Normal"/>
+              <w:jc w:val="start"/>
+              <w:rPr/>
+            </w:pPr>
+            <w:r>
+              <w:rPr>
+                <w:rFonts w:eastAsia="Arial" w:cs="Arial"/>
+                <w:color w:val="1A1A1A"/>
+                <w:sz w:val="18"/>
+                <w:szCs w:val="18"/>
+              </w:rPr>
+              <w:t xml:space="preserve">⬜ </w:t>
+            </w:r>
+            <w:r>
+              <w:rPr>
+                <w:rFonts w:eastAsia="Arial" w:cs="Arial"/>
+                <w:color w:val="1A1A1A"/>
+                <w:sz w:val="18"/>
+                <w:szCs w:val="18"/>
+              </w:rPr>
+              <w:t>Pendiente</w:t>
+            </w:r>
+          </w:p>
+        </w:tc>
+      </w:tr>
+      <w:tr>
+        <w:trPr/>
+        <w:tc>
+          <w:tcPr>
+            <w:tcW w:w="1197" w:type="dxa"/>
             <w:tcBorders>
               <w:top w:val="single" w:sz="2" w:space="0" w:color="DDDDDD"/>
               <w:start w:val="single" w:sz="2" w:space="0" w:color="DDDDDD"/>
@@ -11192,13 +11440,13 @@
                 <w:sz w:val="18"/>
                 <w:szCs w:val="18"/>
               </w:rPr>
-              <w:t>4</w:t>
-            </w:r>
-          </w:p>
-        </w:tc>
-        <w:tc>
-          <w:tcPr>
-            <w:tcW w:w="2802" w:type="dxa"/>
+              <w:t>6-7</w:t>
+            </w:r>
+          </w:p>
+        </w:tc>
+        <w:tc>
+          <w:tcPr>
+            <w:tcW w:w="2803" w:type="dxa"/>
             <w:tcBorders>
               <w:top w:val="single" w:sz="2" w:space="0" w:color="DDDDDD"/>
               <w:start w:val="single" w:sz="2" w:space="0" w:color="DDDDDD"/>
@@ -11220,7 +11468,7 @@
                 <w:sz w:val="18"/>
                 <w:szCs w:val="18"/>
               </w:rPr>
-              <w:t>Etapa 4: Integración Groq API</w:t>
+              <w:t>Etapa 6: Frontend React + Tailwind</w:t>
             </w:r>
           </w:p>
         </w:tc>
@@ -11248,7 +11496,7 @@
                 <w:sz w:val="18"/>
                 <w:szCs w:val="18"/>
               </w:rPr>
-              <w:t>~2 hs</w:t>
+              <w:t>~3 hs</w:t>
             </w:r>
           </w:p>
         </w:tc>
@@ -11294,7 +11542,7 @@
         <w:trPr/>
         <w:tc>
           <w:tcPr>
-            <w:tcW w:w="1198" w:type="dxa"/>
+            <w:tcW w:w="1197" w:type="dxa"/>
             <w:tcBorders>
               <w:top w:val="single" w:sz="2" w:space="0" w:color="DDDDDD"/>
               <w:start w:val="single" w:sz="2" w:space="0" w:color="DDDDDD"/>
@@ -11316,13 +11564,13 @@
                 <w:sz w:val="18"/>
                 <w:szCs w:val="18"/>
               </w:rPr>
-              <w:t>5</w:t>
-            </w:r>
-          </w:p>
-        </w:tc>
-        <w:tc>
-          <w:tcPr>
-            <w:tcW w:w="2802" w:type="dxa"/>
+              <w:t>8</w:t>
+            </w:r>
+          </w:p>
+        </w:tc>
+        <w:tc>
+          <w:tcPr>
+            <w:tcW w:w="2803" w:type="dxa"/>
             <w:tcBorders>
               <w:top w:val="single" w:sz="2" w:space="0" w:color="DDDDDD"/>
               <w:start w:val="single" w:sz="2" w:space="0" w:color="DDDDDD"/>
@@ -11344,7 +11592,7 @@
                 <w:sz w:val="18"/>
                 <w:szCs w:val="18"/>
               </w:rPr>
-              <w:t>Etapa 5: Backend Flask REST</w:t>
+              <w:t>Etapa 7: Documentación + GitHub</w:t>
             </w:r>
           </w:p>
         </w:tc>
@@ -11372,7 +11620,7 @@
                 <w:sz w:val="18"/>
                 <w:szCs w:val="18"/>
               </w:rPr>
-              <w:t>~1.5 hs</w:t>
+              <w:t>~1 hs</w:t>
             </w:r>
           </w:p>
         </w:tc>
@@ -11418,255 +11666,7 @@
         <w:trPr/>
         <w:tc>
           <w:tcPr>
-            <w:tcW w:w="1198" w:type="dxa"/>
-            <w:tcBorders>
-              <w:top w:val="single" w:sz="2" w:space="0" w:color="DDDDDD"/>
-              <w:start w:val="single" w:sz="2" w:space="0" w:color="DDDDDD"/>
-              <w:bottom w:val="single" w:sz="2" w:space="0" w:color="DDDDDD"/>
-              <w:end w:val="single" w:sz="2" w:space="0" w:color="DDDDDD"/>
-            </w:tcBorders>
-            <w:shd w:fill="FFFFFF" w:val="clear"/>
-          </w:tcPr>
-          <w:p>
-            <w:pPr>
-              <w:pStyle w:val="Normal"/>
-              <w:jc w:val="center"/>
-              <w:rPr/>
-            </w:pPr>
-            <w:r>
-              <w:rPr>
-                <w:rFonts w:eastAsia="Arial" w:cs="Arial"/>
-                <w:color w:val="1A1A1A"/>
-                <w:sz w:val="18"/>
-                <w:szCs w:val="18"/>
-              </w:rPr>
-              <w:t>6-7</w:t>
-            </w:r>
-          </w:p>
-        </w:tc>
-        <w:tc>
-          <w:tcPr>
-            <w:tcW w:w="2802" w:type="dxa"/>
-            <w:tcBorders>
-              <w:top w:val="single" w:sz="2" w:space="0" w:color="DDDDDD"/>
-              <w:start w:val="single" w:sz="2" w:space="0" w:color="DDDDDD"/>
-              <w:bottom w:val="single" w:sz="2" w:space="0" w:color="DDDDDD"/>
-              <w:end w:val="single" w:sz="2" w:space="0" w:color="DDDDDD"/>
-            </w:tcBorders>
-            <w:shd w:fill="FFFFFF" w:val="clear"/>
-          </w:tcPr>
-          <w:p>
-            <w:pPr>
-              <w:pStyle w:val="Normal"/>
-              <w:jc w:val="start"/>
-              <w:rPr/>
-            </w:pPr>
-            <w:r>
-              <w:rPr>
-                <w:rFonts w:eastAsia="Arial" w:cs="Arial"/>
-                <w:color w:val="1A1A1A"/>
-                <w:sz w:val="18"/>
-                <w:szCs w:val="18"/>
-              </w:rPr>
-              <w:t>Etapa 6: Frontend React + Tailwind</w:t>
-            </w:r>
-          </w:p>
-        </w:tc>
-        <w:tc>
-          <w:tcPr>
-            <w:tcW w:w="1800" w:type="dxa"/>
-            <w:tcBorders>
-              <w:top w:val="single" w:sz="2" w:space="0" w:color="DDDDDD"/>
-              <w:start w:val="single" w:sz="2" w:space="0" w:color="DDDDDD"/>
-              <w:bottom w:val="single" w:sz="2" w:space="0" w:color="DDDDDD"/>
-              <w:end w:val="single" w:sz="2" w:space="0" w:color="DDDDDD"/>
-            </w:tcBorders>
-            <w:shd w:fill="FFFFFF" w:val="clear"/>
-          </w:tcPr>
-          <w:p>
-            <w:pPr>
-              <w:pStyle w:val="Normal"/>
-              <w:jc w:val="center"/>
-              <w:rPr/>
-            </w:pPr>
-            <w:r>
-              <w:rPr>
-                <w:rFonts w:eastAsia="Arial" w:cs="Arial"/>
-                <w:color w:val="1A1A1A"/>
-                <w:sz w:val="18"/>
-                <w:szCs w:val="18"/>
-              </w:rPr>
-              <w:t>~3 hs</w:t>
-            </w:r>
-          </w:p>
-        </w:tc>
-        <w:tc>
-          <w:tcPr>
-            <w:tcW w:w="2560" w:type="dxa"/>
-            <w:tcBorders>
-              <w:top w:val="single" w:sz="2" w:space="0" w:color="DDDDDD"/>
-              <w:start w:val="single" w:sz="2" w:space="0" w:color="DDDDDD"/>
-              <w:bottom w:val="single" w:sz="2" w:space="0" w:color="DDDDDD"/>
-              <w:end w:val="single" w:sz="2" w:space="0" w:color="DDDDDD"/>
-            </w:tcBorders>
-            <w:shd w:fill="FFFFFF" w:val="clear"/>
-          </w:tcPr>
-          <w:p>
-            <w:pPr>
-              <w:pStyle w:val="Normal"/>
-              <w:jc w:val="start"/>
-              <w:rPr/>
-            </w:pPr>
-            <w:r>
-              <w:rPr>
-                <w:rFonts w:eastAsia="Arial" w:cs="Arial"/>
-                <w:color w:val="1A1A1A"/>
-                <w:sz w:val="18"/>
-                <w:szCs w:val="18"/>
-              </w:rPr>
-              <w:t xml:space="preserve">⬜ </w:t>
-            </w:r>
-            <w:r>
-              <w:rPr>
-                <w:rFonts w:eastAsia="Arial" w:cs="Arial"/>
-                <w:color w:val="1A1A1A"/>
-                <w:sz w:val="18"/>
-                <w:szCs w:val="18"/>
-              </w:rPr>
-              <w:t>Pendiente</w:t>
-            </w:r>
-          </w:p>
-        </w:tc>
-      </w:tr>
-      <w:tr>
-        <w:trPr/>
-        <w:tc>
-          <w:tcPr>
-            <w:tcW w:w="1198" w:type="dxa"/>
-            <w:tcBorders>
-              <w:top w:val="single" w:sz="2" w:space="0" w:color="DDDDDD"/>
-              <w:start w:val="single" w:sz="2" w:space="0" w:color="DDDDDD"/>
-              <w:bottom w:val="single" w:sz="2" w:space="0" w:color="DDDDDD"/>
-              <w:end w:val="single" w:sz="2" w:space="0" w:color="DDDDDD"/>
-            </w:tcBorders>
-            <w:shd w:fill="F2F2F2" w:val="clear"/>
-          </w:tcPr>
-          <w:p>
-            <w:pPr>
-              <w:pStyle w:val="Normal"/>
-              <w:jc w:val="center"/>
-              <w:rPr/>
-            </w:pPr>
-            <w:r>
-              <w:rPr>
-                <w:rFonts w:eastAsia="Arial" w:cs="Arial"/>
-                <w:color w:val="1A1A1A"/>
-                <w:sz w:val="18"/>
-                <w:szCs w:val="18"/>
-              </w:rPr>
-              <w:t>8</w:t>
-            </w:r>
-          </w:p>
-        </w:tc>
-        <w:tc>
-          <w:tcPr>
-            <w:tcW w:w="2802" w:type="dxa"/>
-            <w:tcBorders>
-              <w:top w:val="single" w:sz="2" w:space="0" w:color="DDDDDD"/>
-              <w:start w:val="single" w:sz="2" w:space="0" w:color="DDDDDD"/>
-              <w:bottom w:val="single" w:sz="2" w:space="0" w:color="DDDDDD"/>
-              <w:end w:val="single" w:sz="2" w:space="0" w:color="DDDDDD"/>
-            </w:tcBorders>
-            <w:shd w:fill="F2F2F2" w:val="clear"/>
-          </w:tcPr>
-          <w:p>
-            <w:pPr>
-              <w:pStyle w:val="Normal"/>
-              <w:jc w:val="start"/>
-              <w:rPr/>
-            </w:pPr>
-            <w:r>
-              <w:rPr>
-                <w:rFonts w:eastAsia="Arial" w:cs="Arial"/>
-                <w:color w:val="1A1A1A"/>
-                <w:sz w:val="18"/>
-                <w:szCs w:val="18"/>
-              </w:rPr>
-              <w:t>Etapa 7: Documentación + GitHub</w:t>
-            </w:r>
-          </w:p>
-        </w:tc>
-        <w:tc>
-          <w:tcPr>
-            <w:tcW w:w="1800" w:type="dxa"/>
-            <w:tcBorders>
-              <w:top w:val="single" w:sz="2" w:space="0" w:color="DDDDDD"/>
-              <w:start w:val="single" w:sz="2" w:space="0" w:color="DDDDDD"/>
-              <w:bottom w:val="single" w:sz="2" w:space="0" w:color="DDDDDD"/>
-              <w:end w:val="single" w:sz="2" w:space="0" w:color="DDDDDD"/>
-            </w:tcBorders>
-            <w:shd w:fill="F2F2F2" w:val="clear"/>
-          </w:tcPr>
-          <w:p>
-            <w:pPr>
-              <w:pStyle w:val="Normal"/>
-              <w:jc w:val="center"/>
-              <w:rPr/>
-            </w:pPr>
-            <w:r>
-              <w:rPr>
-                <w:rFonts w:eastAsia="Arial" w:cs="Arial"/>
-                <w:color w:val="1A1A1A"/>
-                <w:sz w:val="18"/>
-                <w:szCs w:val="18"/>
-              </w:rPr>
-              <w:t>~1 hs</w:t>
-            </w:r>
-          </w:p>
-        </w:tc>
-        <w:tc>
-          <w:tcPr>
-            <w:tcW w:w="2560" w:type="dxa"/>
-            <w:tcBorders>
-              <w:top w:val="single" w:sz="2" w:space="0" w:color="DDDDDD"/>
-              <w:start w:val="single" w:sz="2" w:space="0" w:color="DDDDDD"/>
-              <w:bottom w:val="single" w:sz="2" w:space="0" w:color="DDDDDD"/>
-              <w:end w:val="single" w:sz="2" w:space="0" w:color="DDDDDD"/>
-            </w:tcBorders>
-            <w:shd w:fill="F2F2F2" w:val="clear"/>
-          </w:tcPr>
-          <w:p>
-            <w:pPr>
-              <w:pStyle w:val="Normal"/>
-              <w:jc w:val="start"/>
-              <w:rPr/>
-            </w:pPr>
-            <w:r>
-              <w:rPr>
-                <w:rFonts w:eastAsia="Arial" w:cs="Arial"/>
-                <w:color w:val="1A1A1A"/>
-                <w:sz w:val="18"/>
-                <w:szCs w:val="18"/>
-              </w:rPr>
-              <w:t xml:space="preserve">⬜ </w:t>
-            </w:r>
-            <w:r>
-              <w:rPr>
-                <w:rFonts w:eastAsia="Arial" w:cs="Arial"/>
-                <w:color w:val="1A1A1A"/>
-                <w:sz w:val="18"/>
-                <w:szCs w:val="18"/>
-              </w:rPr>
-              <w:t>Pendiente</w:t>
-            </w:r>
-          </w:p>
-        </w:tc>
-      </w:tr>
-      <w:tr>
-        <w:trPr/>
-        <w:tc>
-          <w:tcPr>
-            <w:tcW w:w="1198" w:type="dxa"/>
+            <w:tcW w:w="1197" w:type="dxa"/>
             <w:tcBorders>
               <w:top w:val="single" w:sz="2" w:space="0" w:color="DDDDDD"/>
               <w:start w:val="single" w:sz="2" w:space="0" w:color="DDDDDD"/>
@@ -11695,7 +11695,7 @@
         </w:tc>
         <w:tc>
           <w:tcPr>
-            <w:tcW w:w="2802" w:type="dxa"/>
+            <w:tcW w:w="2803" w:type="dxa"/>
             <w:tcBorders>
               <w:top w:val="single" w:sz="2" w:space="0" w:color="DDDDDD"/>
               <w:start w:val="single" w:sz="2" w:space="0" w:color="DDDDDD"/>
@@ -13265,8 +13265,8 @@
       <w:u w:val="single"/>
     </w:rPr>
   </w:style>
-  <w:style w:type="character" w:styleId="FootnoteCharactersuser">
-    <w:name w:val="Footnote Characters (user)"/>
+  <w:style w:type="character" w:styleId="FootnoteCharacters">
+    <w:name w:val="Footnote Characters"/>
     <w:uiPriority w:val="99"/>
     <w:semiHidden/>
     <w:unhideWhenUsed/>
@@ -13275,8 +13275,8 @@
       <w:vertAlign w:val="superscript"/>
     </w:rPr>
   </w:style>
-  <w:style w:type="character" w:styleId="FootnoteCharacters">
-    <w:name w:val="Footnote Characters"/>
+  <w:style w:type="character" w:styleId="FootnoteCharactersuser">
+    <w:name w:val="Footnote Characters (user)"/>
     <w:qFormat/>
     <w:rPr>
       <w:vertAlign w:val="superscript"/>
@@ -13300,8 +13300,8 @@
       <w:szCs w:val="20"/>
     </w:rPr>
   </w:style>
-  <w:style w:type="character" w:styleId="EndnoteCharactersuser">
-    <w:name w:val="Endnote Characters (user)"/>
+  <w:style w:type="character" w:styleId="EndnoteCharacters">
+    <w:name w:val="Endnote Characters"/>
     <w:uiPriority w:val="99"/>
     <w:semiHidden/>
     <w:unhideWhenUsed/>
@@ -13310,8 +13310,8 @@
       <w:vertAlign w:val="superscript"/>
     </w:rPr>
   </w:style>
-  <w:style w:type="character" w:styleId="EndnoteCharacters">
-    <w:name w:val="Endnote Characters"/>
+  <w:style w:type="character" w:styleId="EndnoteCharactersuser">
+    <w:name w:val="Endnote Characters (user)"/>
     <w:qFormat/>
     <w:rPr>
       <w:vertAlign w:val="superscript"/>

</xml_diff>

<commit_message>
feat: Etapa 4 — integración Groq API para reportes ejecutivos + test suite
Agrega backend/app/ai_report.py con generar_reporte() que convierte el
payload de KPIs en un reporte narrativo en español con terminología bancaria
argentina, manejo robusto de errores del SDK y sin crashes. Incluye 13 tests
mockeados en backend/tests/test_ai_report.py (80 tests passing en total).

Co-Authored-By: Claude Sonnet 4.6 <noreply@anthropic.com>
</commit_message>
<xml_diff>
--- a/docs/credit_portfolio_analyzer_plan.docx
+++ b/docs/credit_portfolio_analyzer_plan.docx
@@ -11265,27 +11265,27 @@
           </w:tcPr>
           <w:p>
             <w:pPr>
-              <w:pStyle w:val="Normal"/>
-              <w:jc w:val="start"/>
-              <w:rPr/>
-            </w:pPr>
-            <w:r>
-              <w:rPr>
-                <w:rFonts w:eastAsia="Arial" w:cs="Arial"/>
-                <w:color w:val="1A1A1A"/>
-                <w:sz w:val="18"/>
-                <w:szCs w:val="18"/>
-              </w:rPr>
-              <w:t xml:space="preserve">⬜ </w:t>
-            </w:r>
-            <w:r>
-              <w:rPr>
-                <w:rFonts w:eastAsia="Arial" w:cs="Arial"/>
-                <w:color w:val="1A1A1A"/>
-                <w:sz w:val="18"/>
-                <w:szCs w:val="18"/>
-              </w:rPr>
-              <w:t>Pendiente</w:t>
+              <w:pStyle w:val="ListParagraph"/>
+              <w:spacing w:before="0" w:after="60"/>
+              <w:rPr/>
+            </w:pPr>
+            <w:r>
+              <w:rPr>
+                <w:rFonts w:eastAsia="Arial" w:cs="Arial"/>
+                <w:color w:val="1A1A1A"/>
+                <w:sz w:val="20"/>
+                <w:szCs w:val="20"/>
+              </w:rPr>
+              <w:t xml:space="preserve">✅ </w:t>
+            </w:r>
+            <w:r>
+              <w:rPr>
+                <w:rFonts w:eastAsia="Arial" w:cs="Arial"/>
+                <w:color w:val="1A1A1A"/>
+                <w:sz w:val="20"/>
+                <w:szCs w:val="20"/>
+              </w:rPr>
+              <w:t>Completo</w:t>
             </w:r>
           </w:p>
         </w:tc>
@@ -13265,8 +13265,8 @@
       <w:u w:val="single"/>
     </w:rPr>
   </w:style>
-  <w:style w:type="character" w:styleId="FootnoteCharacters">
-    <w:name w:val="Footnote Characters"/>
+  <w:style w:type="character" w:styleId="FootnoteCharactersuser">
+    <w:name w:val="Footnote Characters (user)"/>
     <w:uiPriority w:val="99"/>
     <w:semiHidden/>
     <w:unhideWhenUsed/>
@@ -13275,8 +13275,8 @@
       <w:vertAlign w:val="superscript"/>
     </w:rPr>
   </w:style>
-  <w:style w:type="character" w:styleId="FootnoteCharactersuser">
-    <w:name w:val="Footnote Characters (user)"/>
+  <w:style w:type="character" w:styleId="FootnoteCharacters">
+    <w:name w:val="Footnote Characters"/>
     <w:qFormat/>
     <w:rPr>
       <w:vertAlign w:val="superscript"/>
@@ -13300,8 +13300,8 @@
       <w:szCs w:val="20"/>
     </w:rPr>
   </w:style>
-  <w:style w:type="character" w:styleId="EndnoteCharacters">
-    <w:name w:val="Endnote Characters"/>
+  <w:style w:type="character" w:styleId="EndnoteCharactersuser">
+    <w:name w:val="Endnote Characters (user)"/>
     <w:uiPriority w:val="99"/>
     <w:semiHidden/>
     <w:unhideWhenUsed/>
@@ -13310,8 +13310,8 @@
       <w:vertAlign w:val="superscript"/>
     </w:rPr>
   </w:style>
-  <w:style w:type="character" w:styleId="EndnoteCharactersuser">
-    <w:name w:val="Endnote Characters (user)"/>
+  <w:style w:type="character" w:styleId="EndnoteCharacters">
+    <w:name w:val="Endnote Characters"/>
     <w:qFormat/>
     <w:rPr>
       <w:vertAlign w:val="superscript"/>
@@ -13473,6 +13473,29 @@
       <w:szCs w:val="20"/>
     </w:rPr>
   </w:style>
+  <w:style w:type="paragraph" w:styleId="TableContents">
+    <w:name w:val="Table Contents"/>
+    <w:basedOn w:val="Normal"/>
+    <w:qFormat/>
+    <w:pPr>
+      <w:widowControl w:val="false"/>
+      <w:suppressLineNumbers/>
+    </w:pPr>
+    <w:rPr/>
+  </w:style>
+  <w:style w:type="paragraph" w:styleId="TableHeading">
+    <w:name w:val="Table Heading"/>
+    <w:basedOn w:val="TableContents"/>
+    <w:qFormat/>
+    <w:pPr>
+      <w:suppressLineNumbers/>
+      <w:jc w:val="center"/>
+    </w:pPr>
+    <w:rPr>
+      <w:b/>
+      <w:bCs/>
+    </w:rPr>
+  </w:style>
 </w:styles>
 </file>
 

</xml_diff>

<commit_message>
feat: Etapa 5 — backend Flask con API REST + test suite
Implementa create_app() con factory pattern (CORS + blueprint),
7 endpoints en /api (health, kpis, mora-segmentos, top-clientes,
distribucion-productos, situacion-bcra, reporte) y 21 tests nuevos.
Total: 101 tests passing.

Co-Authored-By: Claude Sonnet 4.6 <noreply@anthropic.com>
</commit_message>
<xml_diff>
--- a/docs/credit_portfolio_analyzer_plan.docx
+++ b/docs/credit_portfolio_analyzer_plan.docx
@@ -11389,27 +11389,27 @@
           </w:tcPr>
           <w:p>
             <w:pPr>
-              <w:pStyle w:val="Normal"/>
-              <w:jc w:val="start"/>
-              <w:rPr/>
-            </w:pPr>
-            <w:r>
-              <w:rPr>
-                <w:rFonts w:eastAsia="Arial" w:cs="Arial"/>
-                <w:color w:val="1A1A1A"/>
-                <w:sz w:val="18"/>
-                <w:szCs w:val="18"/>
-              </w:rPr>
-              <w:t xml:space="preserve">⬜ </w:t>
-            </w:r>
-            <w:r>
-              <w:rPr>
-                <w:rFonts w:eastAsia="Arial" w:cs="Arial"/>
-                <w:color w:val="1A1A1A"/>
-                <w:sz w:val="18"/>
-                <w:szCs w:val="18"/>
-              </w:rPr>
-              <w:t>Pendiente</w:t>
+              <w:pStyle w:val="ListParagraph"/>
+              <w:spacing w:before="0" w:after="60"/>
+              <w:rPr/>
+            </w:pPr>
+            <w:r>
+              <w:rPr>
+                <w:rFonts w:eastAsia="Arial" w:cs="Arial"/>
+                <w:color w:val="1A1A1A"/>
+                <w:sz w:val="20"/>
+                <w:szCs w:val="20"/>
+              </w:rPr>
+              <w:t xml:space="preserve">✅ </w:t>
+            </w:r>
+            <w:r>
+              <w:rPr>
+                <w:rFonts w:eastAsia="Arial" w:cs="Arial"/>
+                <w:color w:val="1A1A1A"/>
+                <w:sz w:val="20"/>
+                <w:szCs w:val="20"/>
+              </w:rPr>
+              <w:t>Completo</w:t>
             </w:r>
           </w:p>
         </w:tc>
@@ -13265,8 +13265,8 @@
       <w:u w:val="single"/>
     </w:rPr>
   </w:style>
-  <w:style w:type="character" w:styleId="FootnoteCharactersuser">
-    <w:name w:val="Footnote Characters (user)"/>
+  <w:style w:type="character" w:styleId="FootnoteCharacters">
+    <w:name w:val="Footnote Characters"/>
     <w:uiPriority w:val="99"/>
     <w:semiHidden/>
     <w:unhideWhenUsed/>
@@ -13275,8 +13275,8 @@
       <w:vertAlign w:val="superscript"/>
     </w:rPr>
   </w:style>
-  <w:style w:type="character" w:styleId="FootnoteCharacters">
-    <w:name w:val="Footnote Characters"/>
+  <w:style w:type="character" w:styleId="FootnoteCharactersuser">
+    <w:name w:val="Footnote Characters (user)"/>
     <w:qFormat/>
     <w:rPr>
       <w:vertAlign w:val="superscript"/>
@@ -13300,8 +13300,8 @@
       <w:szCs w:val="20"/>
     </w:rPr>
   </w:style>
-  <w:style w:type="character" w:styleId="EndnoteCharactersuser">
-    <w:name w:val="Endnote Characters (user)"/>
+  <w:style w:type="character" w:styleId="EndnoteCharacters">
+    <w:name w:val="Endnote Characters"/>
     <w:uiPriority w:val="99"/>
     <w:semiHidden/>
     <w:unhideWhenUsed/>
@@ -13310,8 +13310,8 @@
       <w:vertAlign w:val="superscript"/>
     </w:rPr>
   </w:style>
-  <w:style w:type="character" w:styleId="EndnoteCharacters">
-    <w:name w:val="Endnote Characters"/>
+  <w:style w:type="character" w:styleId="EndnoteCharactersuser">
+    <w:name w:val="Endnote Characters (user)"/>
     <w:qFormat/>
     <w:rPr>
       <w:vertAlign w:val="superscript"/>

</xml_diff>

<commit_message>
feat: Etapas 6 y 7 — frontend React dark mode + corrección dominio BCRA + README
Frontend: dashboard completo con React 18 + Vite + Tailwind CSS v4 + Chart.js.
6 KpiCards semafóricos, gráfico de mora, tabla top-10 deudores, reporte ejecutivo IA.

Corrección de dominio: calificacion_interna (A-E) reemplazada por situacion_deudor
(1-5 BCRA), calculada como MAX(situacion_bcra) de todas las deudas del cliente
según Comunicación A 2216/6938. 102 tests passing.

README profesional orientado a portfolio: contexto bancario, arquitectura, stack,
decisiones técnicas, instalación y screenshot del dashboard.

Co-Authored-By: Claude Sonnet 4.6 <noreply@anthropic.com>
</commit_message>
<xml_diff>
--- a/docs/credit_portfolio_analyzer_plan.docx
+++ b/docs/credit_portfolio_analyzer_plan.docx
@@ -11513,6 +11513,74 @@
           </w:tcPr>
           <w:p>
             <w:pPr>
+              <w:pStyle w:val="ListParagraph"/>
+              <w:spacing w:before="0" w:after="60"/>
+              <w:rPr/>
+            </w:pPr>
+            <w:r>
+              <w:rPr>
+                <w:rFonts w:eastAsia="Arial" w:cs="Arial"/>
+                <w:color w:val="1A1A1A"/>
+                <w:sz w:val="20"/>
+                <w:szCs w:val="20"/>
+              </w:rPr>
+              <w:t xml:space="preserve">✅ </w:t>
+            </w:r>
+            <w:r>
+              <w:rPr>
+                <w:rFonts w:eastAsia="Arial" w:cs="Arial"/>
+                <w:color w:val="1A1A1A"/>
+                <w:sz w:val="20"/>
+                <w:szCs w:val="20"/>
+              </w:rPr>
+              <w:t>Completo</w:t>
+            </w:r>
+          </w:p>
+        </w:tc>
+      </w:tr>
+      <w:tr>
+        <w:trPr/>
+        <w:tc>
+          <w:tcPr>
+            <w:tcW w:w="1197" w:type="dxa"/>
+            <w:tcBorders>
+              <w:top w:val="single" w:sz="2" w:space="0" w:color="DDDDDD"/>
+              <w:start w:val="single" w:sz="2" w:space="0" w:color="DDDDDD"/>
+              <w:bottom w:val="single" w:sz="2" w:space="0" w:color="DDDDDD"/>
+              <w:end w:val="single" w:sz="2" w:space="0" w:color="DDDDDD"/>
+            </w:tcBorders>
+            <w:shd w:fill="F2F2F2" w:val="clear"/>
+          </w:tcPr>
+          <w:p>
+            <w:pPr>
+              <w:pStyle w:val="Normal"/>
+              <w:jc w:val="center"/>
+              <w:rPr/>
+            </w:pPr>
+            <w:r>
+              <w:rPr>
+                <w:rFonts w:eastAsia="Arial" w:cs="Arial"/>
+                <w:color w:val="1A1A1A"/>
+                <w:sz w:val="18"/>
+                <w:szCs w:val="18"/>
+              </w:rPr>
+              <w:t>8</w:t>
+            </w:r>
+          </w:p>
+        </w:tc>
+        <w:tc>
+          <w:tcPr>
+            <w:tcW w:w="2803" w:type="dxa"/>
+            <w:tcBorders>
+              <w:top w:val="single" w:sz="2" w:space="0" w:color="DDDDDD"/>
+              <w:start w:val="single" w:sz="2" w:space="0" w:color="DDDDDD"/>
+              <w:bottom w:val="single" w:sz="2" w:space="0" w:color="DDDDDD"/>
+              <w:end w:val="single" w:sz="2" w:space="0" w:color="DDDDDD"/>
+            </w:tcBorders>
+            <w:shd w:fill="F2F2F2" w:val="clear"/>
+          </w:tcPr>
+          <w:p>
+            <w:pPr>
               <w:pStyle w:val="Normal"/>
               <w:jc w:val="start"/>
               <w:rPr/>
@@ -11524,25 +11592,13 @@
                 <w:sz w:val="18"/>
                 <w:szCs w:val="18"/>
               </w:rPr>
-              <w:t xml:space="preserve">⬜ </w:t>
-            </w:r>
-            <w:r>
-              <w:rPr>
-                <w:rFonts w:eastAsia="Arial" w:cs="Arial"/>
-                <w:color w:val="1A1A1A"/>
-                <w:sz w:val="18"/>
-                <w:szCs w:val="18"/>
-              </w:rPr>
-              <w:t>Pendiente</w:t>
-            </w:r>
-          </w:p>
-        </w:tc>
-      </w:tr>
-      <w:tr>
-        <w:trPr/>
-        <w:tc>
-          <w:tcPr>
-            <w:tcW w:w="1197" w:type="dxa"/>
+              <w:t>Etapa 7: Documentación + GitHub</w:t>
+            </w:r>
+          </w:p>
+        </w:tc>
+        <w:tc>
+          <w:tcPr>
+            <w:tcW w:w="1800" w:type="dxa"/>
             <w:tcBorders>
               <w:top w:val="single" w:sz="2" w:space="0" w:color="DDDDDD"/>
               <w:start w:val="single" w:sz="2" w:space="0" w:color="DDDDDD"/>
@@ -11564,13 +11620,13 @@
                 <w:sz w:val="18"/>
                 <w:szCs w:val="18"/>
               </w:rPr>
-              <w:t>8</w:t>
-            </w:r>
-          </w:p>
-        </w:tc>
-        <w:tc>
-          <w:tcPr>
-            <w:tcW w:w="2803" w:type="dxa"/>
+              <w:t>~1 hs</w:t>
+            </w:r>
+          </w:p>
+        </w:tc>
+        <w:tc>
+          <w:tcPr>
+            <w:tcW w:w="2560" w:type="dxa"/>
             <w:tcBorders>
               <w:top w:val="single" w:sz="2" w:space="0" w:color="DDDDDD"/>
               <w:start w:val="single" w:sz="2" w:space="0" w:color="DDDDDD"/>
@@ -11581,83 +11637,27 @@
           </w:tcPr>
           <w:p>
             <w:pPr>
-              <w:pStyle w:val="Normal"/>
-              <w:jc w:val="start"/>
-              <w:rPr/>
-            </w:pPr>
-            <w:r>
-              <w:rPr>
-                <w:rFonts w:eastAsia="Arial" w:cs="Arial"/>
-                <w:color w:val="1A1A1A"/>
-                <w:sz w:val="18"/>
-                <w:szCs w:val="18"/>
-              </w:rPr>
-              <w:t>Etapa 7: Documentación + GitHub</w:t>
-            </w:r>
-          </w:p>
-        </w:tc>
-        <w:tc>
-          <w:tcPr>
-            <w:tcW w:w="1800" w:type="dxa"/>
-            <w:tcBorders>
-              <w:top w:val="single" w:sz="2" w:space="0" w:color="DDDDDD"/>
-              <w:start w:val="single" w:sz="2" w:space="0" w:color="DDDDDD"/>
-              <w:bottom w:val="single" w:sz="2" w:space="0" w:color="DDDDDD"/>
-              <w:end w:val="single" w:sz="2" w:space="0" w:color="DDDDDD"/>
-            </w:tcBorders>
-            <w:shd w:fill="F2F2F2" w:val="clear"/>
-          </w:tcPr>
-          <w:p>
-            <w:pPr>
-              <w:pStyle w:val="Normal"/>
-              <w:jc w:val="center"/>
-              <w:rPr/>
-            </w:pPr>
-            <w:r>
-              <w:rPr>
-                <w:rFonts w:eastAsia="Arial" w:cs="Arial"/>
-                <w:color w:val="1A1A1A"/>
-                <w:sz w:val="18"/>
-                <w:szCs w:val="18"/>
-              </w:rPr>
-              <w:t>~1 hs</w:t>
-            </w:r>
-          </w:p>
-        </w:tc>
-        <w:tc>
-          <w:tcPr>
-            <w:tcW w:w="2560" w:type="dxa"/>
-            <w:tcBorders>
-              <w:top w:val="single" w:sz="2" w:space="0" w:color="DDDDDD"/>
-              <w:start w:val="single" w:sz="2" w:space="0" w:color="DDDDDD"/>
-              <w:bottom w:val="single" w:sz="2" w:space="0" w:color="DDDDDD"/>
-              <w:end w:val="single" w:sz="2" w:space="0" w:color="DDDDDD"/>
-            </w:tcBorders>
-            <w:shd w:fill="F2F2F2" w:val="clear"/>
-          </w:tcPr>
-          <w:p>
-            <w:pPr>
-              <w:pStyle w:val="Normal"/>
-              <w:jc w:val="start"/>
-              <w:rPr/>
-            </w:pPr>
-            <w:r>
-              <w:rPr>
-                <w:rFonts w:eastAsia="Arial" w:cs="Arial"/>
-                <w:color w:val="1A1A1A"/>
-                <w:sz w:val="18"/>
-                <w:szCs w:val="18"/>
-              </w:rPr>
-              <w:t xml:space="preserve">⬜ </w:t>
-            </w:r>
-            <w:r>
-              <w:rPr>
-                <w:rFonts w:eastAsia="Arial" w:cs="Arial"/>
-                <w:color w:val="1A1A1A"/>
-                <w:sz w:val="18"/>
-                <w:szCs w:val="18"/>
-              </w:rPr>
-              <w:t>Pendiente</w:t>
+              <w:pStyle w:val="ListParagraph"/>
+              <w:spacing w:before="0" w:after="60"/>
+              <w:rPr/>
+            </w:pPr>
+            <w:r>
+              <w:rPr>
+                <w:rFonts w:eastAsia="Arial" w:cs="Arial"/>
+                <w:color w:val="1A1A1A"/>
+                <w:sz w:val="20"/>
+                <w:szCs w:val="20"/>
+              </w:rPr>
+              <w:t xml:space="preserve">✅ </w:t>
+            </w:r>
+            <w:r>
+              <w:rPr>
+                <w:rFonts w:eastAsia="Arial" w:cs="Arial"/>
+                <w:color w:val="1A1A1A"/>
+                <w:sz w:val="20"/>
+                <w:szCs w:val="20"/>
+              </w:rPr>
+              <w:t>Completo</w:t>
             </w:r>
           </w:p>
         </w:tc>

</xml_diff>